<commit_message>
cambiado el manual de usuario
</commit_message>
<xml_diff>
--- a/proyectov5/Manual de usuario.docx
+++ b/proyectov5/Manual de usuario.docx
@@ -1,6 +1,6 @@
 
 <file path=word/document.xml><?xml version="1.0" encoding="utf-8"?>
-<w:document xmlns:wpc="http://schemas.microsoft.com/office/word/2010/wordprocessingCanvas" xmlns:cx="http://schemas.microsoft.com/office/drawing/2014/chartex" xmlns:cx1="http://schemas.microsoft.com/office/drawing/2015/9/8/chartex" xmlns:cx2="http://schemas.microsoft.com/office/drawing/2015/10/21/chartex" xmlns:cx3="http://schemas.microsoft.com/office/drawing/2016/5/9/chartex" xmlns:cx4="http://schemas.microsoft.com/office/drawing/2016/5/10/chartex" xmlns:cx5="http://schemas.microsoft.com/office/drawing/2016/5/11/chartex" xmlns:cx6="http://schemas.microsoft.com/office/drawing/2016/5/12/chartex" xmlns:cx7="http://schemas.microsoft.com/office/drawing/2016/5/13/chartex" xmlns:cx8="http://schemas.microsoft.com/office/drawing/2016/5/14/chartex" xmlns:mc="http://schemas.openxmlformats.org/markup-compatibility/2006" xmlns:aink="http://schemas.microsoft.com/office/drawing/2016/ink" xmlns:am3d="http://schemas.microsoft.com/office/drawing/2017/model3d" xmlns:o="urn:schemas-microsoft-com:office:office" xmlns:oel="http://schemas.microsoft.com/office/2019/extlst" xmlns:r="http://schemas.openxmlformats.org/officeDocument/2006/relationships" xmlns:m="http://schemas.openxmlformats.org/officeDocument/2006/math" xmlns:v="urn:schemas-microsoft-com:vml" xmlns:wp14="http://schemas.microsoft.com/office/word/2010/wordprocessingDrawing" xmlns:wp="http://schemas.openxmlformats.org/drawingml/2006/wordprocessingDrawing" xmlns:w10="urn:schemas-microsoft-com:office:word" xmlns:w="http://schemas.openxmlformats.org/wordprocessingml/2006/main" xmlns:w14="http://schemas.microsoft.com/office/word/2010/wordml" xmlns:w15="http://schemas.microsoft.com/office/word/2012/wordml" xmlns:w16cex="http://schemas.microsoft.com/office/word/2018/wordml/cex" xmlns:w16cid="http://schemas.microsoft.com/office/word/2016/wordml/cid" xmlns:w16="http://schemas.microsoft.com/office/word/2018/wordml" xmlns:w16du="http://schemas.microsoft.com/office/word/2023/wordml/word16du" xmlns:w16sdtdh="http://schemas.microsoft.com/office/word/2020/wordml/sdtdatahash" xmlns:w16sdtfl="http://schemas.microsoft.com/office/word/2024/wordml/sdtformatlock" xmlns:w16se="http://schemas.microsoft.com/office/word/2015/wordml/symex" xmlns:wpg="http://schemas.microsoft.com/office/word/2010/wordprocessingGroup" xmlns:wpi="http://schemas.microsoft.com/office/word/2010/wordprocessingInk" xmlns:wne="http://schemas.microsoft.com/office/word/2006/wordml" xmlns:wps="http://schemas.microsoft.com/office/word/2010/wordprocessingShape" mc:Ignorable="w14 w15 w16se w16cid w16 w16cex w16sdtdh w16sdtfl w16du wp14">
+<w:document xmlns:wpc="http://schemas.microsoft.com/office/word/2010/wordprocessingCanvas" xmlns:cx="http://schemas.microsoft.com/office/drawing/2014/chartex" xmlns:cx1="http://schemas.microsoft.com/office/drawing/2015/9/8/chartex" xmlns:cx2="http://schemas.microsoft.com/office/drawing/2015/10/21/chartex" xmlns:cx3="http://schemas.microsoft.com/office/drawing/2016/5/9/chartex" xmlns:cx4="http://schemas.microsoft.com/office/drawing/2016/5/10/chartex" xmlns:cx5="http://schemas.microsoft.com/office/drawing/2016/5/11/chartex" xmlns:cx6="http://schemas.microsoft.com/office/drawing/2016/5/12/chartex" xmlns:cx7="http://schemas.microsoft.com/office/drawing/2016/5/13/chartex" xmlns:cx8="http://schemas.microsoft.com/office/drawing/2016/5/14/chartex" xmlns:mc="http://schemas.openxmlformats.org/markup-compatibility/2006" xmlns:aink="http://schemas.microsoft.com/office/drawing/2016/ink" xmlns:am3d="http://schemas.microsoft.com/office/drawing/2017/model3d" xmlns:o="urn:schemas-microsoft-com:office:office" xmlns:r="http://schemas.openxmlformats.org/officeDocument/2006/relationships" xmlns:m="http://schemas.openxmlformats.org/officeDocument/2006/math" xmlns:v="urn:schemas-microsoft-com:vml" xmlns:wp14="http://schemas.microsoft.com/office/word/2010/wordprocessingDrawing" xmlns:wp="http://schemas.openxmlformats.org/drawingml/2006/wordprocessingDrawing" xmlns:w10="urn:schemas-microsoft-com:office:word" xmlns:w="http://schemas.openxmlformats.org/wordprocessingml/2006/main" xmlns:w14="http://schemas.microsoft.com/office/word/2010/wordml" xmlns:w15="http://schemas.microsoft.com/office/word/2012/wordml" xmlns:w16cex="http://schemas.microsoft.com/office/word/2018/wordml/cex" xmlns:w16cid="http://schemas.microsoft.com/office/word/2016/wordml/cid" xmlns:w16="http://schemas.microsoft.com/office/word/2018/wordml" xmlns:w16sdtdh="http://schemas.microsoft.com/office/word/2020/wordml/sdtdatahash" xmlns:w16se="http://schemas.microsoft.com/office/word/2015/wordml/symex" xmlns:wpg="http://schemas.microsoft.com/office/word/2010/wordprocessingGroup" xmlns:wpi="http://schemas.microsoft.com/office/word/2010/wordprocessingInk" xmlns:wne="http://schemas.microsoft.com/office/word/2006/wordml" xmlns:wps="http://schemas.microsoft.com/office/word/2010/wordprocessingShape" mc:Ignorable="w14 w15 w16se w16cid w16 w16cex w16sdtdh wp14">
   <w:body>
     <w:p>
       <w:pPr>
@@ -20,639 +20,136 @@
           <w:bCs/>
           <w:lang w:eastAsia="es-CO"/>
         </w:rPr>
-        <w:t>MANUAL TÉCNICO Y DE USUARIO: SISTEMA TIENDA-FARMACIA PIPO</w:t>
+        <w:br/>
+      </w:r>
+      <w:r>
+        <w:rPr>
+          <w:rFonts w:ascii="Arial" w:eastAsia="Times New Roman" w:hAnsi="Arial" w:cs="Arial"/>
+          <w:b/>
+          <w:bCs/>
+          <w:lang w:eastAsia="es-CO"/>
+        </w:rPr>
+        <w:br/>
+      </w:r>
+      <w:r>
+        <w:rPr>
+          <w:rFonts w:ascii="Arial" w:eastAsia="Times New Roman" w:hAnsi="Arial" w:cs="Arial"/>
+          <w:b/>
+          <w:bCs/>
+          <w:lang w:eastAsia="es-CO"/>
+        </w:rPr>
+        <w:br/>
+        <w:t>MANUAL DE USUARIO DEL SISTEMA FARMACIA PIPO</w:t>
+      </w:r>
+      <w:r>
+        <w:rPr>
+          <w:rFonts w:ascii="Arial" w:eastAsia="Times New Roman" w:hAnsi="Arial" w:cs="Arial"/>
+          <w:b/>
+          <w:bCs/>
+          <w:lang w:eastAsia="es-CO"/>
+        </w:rPr>
+        <w:br/>
+      </w:r>
+      <w:r>
+        <w:rPr>
+          <w:rFonts w:ascii="Arial" w:eastAsia="Times New Roman" w:hAnsi="Arial" w:cs="Arial"/>
+          <w:b/>
+          <w:bCs/>
+          <w:lang w:eastAsia="es-CO"/>
+        </w:rPr>
+        <w:br/>
+      </w:r>
+      <w:r>
+        <w:rPr>
+          <w:rFonts w:ascii="Arial" w:eastAsia="Times New Roman" w:hAnsi="Arial" w:cs="Arial"/>
+          <w:lang w:eastAsia="es-CO"/>
+        </w:rPr>
+        <w:t>1- Inicio del programa: Para iniciar el programa se debe de ejecutar un comando en la terminal el cual es el siguiente:</w:t>
+      </w:r>
+      <w:r>
+        <w:rPr>
+          <w:rFonts w:ascii="Arial" w:eastAsia="Times New Roman" w:hAnsi="Arial" w:cs="Arial"/>
+          <w:lang w:eastAsia="es-CO"/>
+        </w:rPr>
+        <w:t xml:space="preserve"> </w:t>
+      </w:r>
+      <w:r>
+        <w:rPr>
+          <w:rFonts w:ascii="Arial" w:eastAsia="Times New Roman" w:hAnsi="Arial" w:cs="Arial"/>
+          <w:lang w:eastAsia="es-CO"/>
+        </w:rPr>
+        <w:br/>
+      </w:r>
+      <w:r>
+        <w:rPr>
+          <w:rFonts w:ascii="Arial" w:eastAsia="Times New Roman" w:hAnsi="Arial" w:cs="Arial"/>
+          <w:lang w:eastAsia="es-CO"/>
+        </w:rPr>
+        <w:br/>
+      </w:r>
+      <w:r>
+        <w:rPr>
+          <w:rFonts w:ascii="Arial" w:eastAsia="Times New Roman" w:hAnsi="Arial" w:cs="Arial"/>
+          <w:lang w:eastAsia="es-CO"/>
+        </w:rPr>
+        <w:t>g++ proyectov5.cpp PRODUCTO.cpp PROVEEDOR.cpp CLIENTES.cpp TRANSACCION.cpp -o programa.exe</w:t>
+      </w:r>
+      <w:r>
+        <w:rPr>
+          <w:rFonts w:ascii="Arial" w:eastAsia="Times New Roman" w:hAnsi="Arial" w:cs="Arial"/>
+          <w:b/>
+          <w:bCs/>
+          <w:lang w:eastAsia="es-CO"/>
+        </w:rPr>
+        <w:br/>
       </w:r>
     </w:p>
     <w:p>
       <w:pPr>
         <w:spacing w:before="100" w:beforeAutospacing="1" w:after="100" w:afterAutospacing="1" w:line="240" w:lineRule="auto"/>
-        <w:outlineLvl w:val="3"/>
-        <w:rPr>
-          <w:rFonts w:ascii="Arial" w:eastAsia="Times New Roman" w:hAnsi="Arial" w:cs="Arial"/>
-          <w:b/>
-          <w:bCs/>
-          <w:lang w:eastAsia="es-CO"/>
-        </w:rPr>
-      </w:pPr>
-      <w:r>
-        <w:rPr>
-          <w:rFonts w:ascii="Arial" w:eastAsia="Times New Roman" w:hAnsi="Arial" w:cs="Arial"/>
-          <w:b/>
-          <w:bCs/>
-          <w:lang w:eastAsia="es-CO"/>
-        </w:rPr>
-        <w:t>1. ARQUITECTURA DEL SISTEMA Y MODULACIÓN</w:t>
+        <w:outlineLvl w:val="2"/>
+        <w:rPr>
+          <w:rFonts w:ascii="Arial" w:eastAsia="Times New Roman" w:hAnsi="Arial" w:cs="Arial"/>
+          <w:b/>
+          <w:bCs/>
+          <w:lang w:eastAsia="es-CO"/>
+        </w:rPr>
+      </w:pPr>
+      <w:r>
+        <w:rPr>
+          <w:rFonts w:ascii="Arial" w:eastAsia="Times New Roman" w:hAnsi="Arial" w:cs="Arial"/>
+          <w:b/>
+          <w:bCs/>
+          <w:lang w:eastAsia="es-CO"/>
+        </w:rPr>
+        <w:t>Luego de Compilar</w:t>
       </w:r>
     </w:p>
     <w:p>
       <w:pPr>
         <w:spacing w:before="100" w:beforeAutospacing="1" w:after="100" w:afterAutospacing="1" w:line="240" w:lineRule="auto"/>
-        <w:rPr>
-          <w:rFonts w:ascii="Arial" w:eastAsia="Times New Roman" w:hAnsi="Arial" w:cs="Arial"/>
-          <w:lang w:eastAsia="es-CO"/>
-        </w:rPr>
-      </w:pPr>
-      <w:r>
-        <w:rPr>
-          <w:rFonts w:ascii="Arial" w:eastAsia="Times New Roman" w:hAnsi="Arial" w:cs="Arial"/>
-          <w:lang w:eastAsia="es-CO"/>
-        </w:rPr>
-        <w:t xml:space="preserve">El software ha sido diseñado bajo un enfoque de </w:t>
-      </w:r>
-      <w:r>
-        <w:rPr>
-          <w:rFonts w:ascii="Arial" w:eastAsia="Times New Roman" w:hAnsi="Arial" w:cs="Arial"/>
-          <w:b/>
-          <w:bCs/>
-          <w:lang w:eastAsia="es-CO"/>
-        </w:rPr>
-        <w:t>Programación Orientada a Objetos (POO)</w:t>
-      </w:r>
-      <w:r>
-        <w:rPr>
-          <w:rFonts w:ascii="Arial" w:eastAsia="Times New Roman" w:hAnsi="Arial" w:cs="Arial"/>
-          <w:lang w:eastAsia="es-CO"/>
-        </w:rPr>
-        <w:t xml:space="preserve"> y una estructura modular. Esto significa que el código no es un bloque único, sino que está dividido en archivos especializados para facilitar su mantenimiento y escalabilidad:</w:t>
-      </w:r>
-    </w:p>
-    <w:p>
-      <w:pPr>
-        <w:numPr>
-          <w:ilvl w:val="0"/>
-          <w:numId w:val="1"/>
-        </w:numPr>
-        <w:spacing w:before="100" w:beforeAutospacing="1" w:after="100" w:afterAutospacing="1" w:line="240" w:lineRule="auto"/>
-        <w:rPr>
-          <w:rFonts w:ascii="Arial" w:eastAsia="Times New Roman" w:hAnsi="Arial" w:cs="Arial"/>
-          <w:lang w:eastAsia="es-CO"/>
-        </w:rPr>
-      </w:pPr>
-      <w:r>
-        <w:rPr>
-          <w:rFonts w:ascii="Arial" w:eastAsia="Times New Roman" w:hAnsi="Arial" w:cs="Arial"/>
-          <w:b/>
-          <w:bCs/>
-          <w:lang w:eastAsia="es-CO"/>
-        </w:rPr>
-        <w:t>Modularidad de Clases (.hpp y .cpp):</w:t>
-      </w:r>
-      <w:r>
-        <w:rPr>
-          <w:rFonts w:ascii="Arial" w:eastAsia="Times New Roman" w:hAnsi="Arial" w:cs="Arial"/>
-          <w:lang w:eastAsia="es-CO"/>
-        </w:rPr>
-        <w:t xml:space="preserve"> Cada entidad del mundo real (Proveedor, Producto, Cliente, Transacción) tiene su propio archivo de cabecera (.hpp) donde se define su estructura y un archivo de implementación (.cpp) donde reside la lógica.</w:t>
-      </w:r>
-    </w:p>
-    <w:p>
-      <w:pPr>
-        <w:numPr>
-          <w:ilvl w:val="0"/>
-          <w:numId w:val="1"/>
-        </w:numPr>
-        <w:spacing w:before="100" w:beforeAutospacing="1" w:after="100" w:afterAutospacing="1" w:line="240" w:lineRule="auto"/>
-        <w:rPr>
-          <w:rFonts w:ascii="Arial" w:eastAsia="Times New Roman" w:hAnsi="Arial" w:cs="Arial"/>
-          <w:lang w:eastAsia="es-CO"/>
-        </w:rPr>
-      </w:pPr>
-      <w:r>
-        <w:rPr>
-          <w:rFonts w:ascii="Arial" w:eastAsia="Times New Roman" w:hAnsi="Arial" w:cs="Arial"/>
-          <w:b/>
-          <w:bCs/>
-          <w:lang w:eastAsia="es-CO"/>
-        </w:rPr>
-        <w:t>Capa de Persistencia:</w:t>
-      </w:r>
-      <w:r>
-        <w:rPr>
-          <w:rFonts w:ascii="Arial" w:eastAsia="Times New Roman" w:hAnsi="Arial" w:cs="Arial"/>
-          <w:lang w:eastAsia="es-CO"/>
-        </w:rPr>
-        <w:t xml:space="preserve"> El sistema utiliza archivos binarios (.bin) para almacenar datos. El uso de archivoHeader permite gestionar metadatos (como la cantidad de registros y el ID siguiente) sin leer todo el archivo, optimizando el rendimiento.</w:t>
-      </w:r>
-    </w:p>
-    <w:p>
-      <w:pPr>
-        <w:numPr>
-          <w:ilvl w:val="0"/>
-          <w:numId w:val="1"/>
-        </w:numPr>
-        <w:spacing w:before="100" w:beforeAutospacing="1" w:after="100" w:afterAutospacing="1" w:line="240" w:lineRule="auto"/>
-        <w:rPr>
-          <w:rFonts w:ascii="Arial" w:eastAsia="Times New Roman" w:hAnsi="Arial" w:cs="Arial"/>
-          <w:lang w:eastAsia="es-CO"/>
-        </w:rPr>
-      </w:pPr>
-      <w:r>
-        <w:rPr>
-          <w:rFonts w:ascii="Arial" w:eastAsia="Times New Roman" w:hAnsi="Arial" w:cs="Arial"/>
-          <w:b/>
-          <w:bCs/>
-          <w:lang w:eastAsia="es-CO"/>
-        </w:rPr>
-        <w:t>Módulo de Soporte (VALIDACIONES):</w:t>
-      </w:r>
-      <w:r>
-        <w:rPr>
-          <w:rFonts w:ascii="Arial" w:eastAsia="Times New Roman" w:hAnsi="Arial" w:cs="Arial"/>
-          <w:lang w:eastAsia="es-CO"/>
-        </w:rPr>
-        <w:t xml:space="preserve"> Un componente transversal que centraliza la limpieza del buffer y la validación de tipos de datos, garantizando que el programa no colapse ante entradas de usuario erróneas.</w:t>
-      </w:r>
-    </w:p>
-    <w:p>
-      <w:pPr>
-        <w:spacing w:after="0" w:line="240" w:lineRule="auto"/>
-        <w:rPr>
-          <w:rFonts w:ascii="Arial" w:eastAsia="Times New Roman" w:hAnsi="Arial" w:cs="Arial"/>
-          <w:lang w:eastAsia="es-CO"/>
-        </w:rPr>
-      </w:pPr>
-      <w:r>
-        <w:rPr>
-          <w:rFonts w:ascii="Arial" w:eastAsia="Times New Roman" w:hAnsi="Arial" w:cs="Arial"/>
-          <w:lang w:eastAsia="es-CO"/>
-        </w:rPr>
-        <w:pict w14:anchorId="0C8B5D01">
-          <v:rect id="_x0000_i1025" style="width:0;height:1.5pt" o:hralign="center" o:hrstd="t" o:hr="t" fillcolor="#a0a0a0" stroked="f"/>
-        </w:pict>
-      </w:r>
-    </w:p>
-    <w:p>
-      <w:pPr>
-        <w:spacing w:before="100" w:beforeAutospacing="1" w:after="100" w:afterAutospacing="1" w:line="240" w:lineRule="auto"/>
-        <w:outlineLvl w:val="3"/>
-        <w:rPr>
-          <w:rFonts w:ascii="Arial" w:eastAsia="Times New Roman" w:hAnsi="Arial" w:cs="Arial"/>
-          <w:b/>
-          <w:bCs/>
-          <w:lang w:eastAsia="es-CO"/>
-        </w:rPr>
-      </w:pPr>
-      <w:r>
-        <w:rPr>
-          <w:rFonts w:ascii="Arial" w:eastAsia="Times New Roman" w:hAnsi="Arial" w:cs="Arial"/>
-          <w:b/>
-          <w:bCs/>
-          <w:lang w:eastAsia="es-CO"/>
-        </w:rPr>
-        <w:t>2. EXPLICACIÓN DE FUNCIONES PRINCIPALES</w:t>
-      </w:r>
-    </w:p>
-    <w:p>
-      <w:pPr>
-        <w:spacing w:before="100" w:beforeAutospacing="1" w:after="100" w:afterAutospacing="1" w:line="240" w:lineRule="auto"/>
-        <w:outlineLvl w:val="4"/>
-        <w:rPr>
-          <w:rFonts w:ascii="Arial" w:eastAsia="Times New Roman" w:hAnsi="Arial" w:cs="Arial"/>
-          <w:b/>
-          <w:bCs/>
-          <w:lang w:eastAsia="es-CO"/>
-        </w:rPr>
-      </w:pPr>
-      <w:r>
-        <w:rPr>
-          <w:rFonts w:ascii="Arial" w:eastAsia="Times New Roman" w:hAnsi="Arial" w:cs="Arial"/>
-          <w:b/>
-          <w:bCs/>
-          <w:lang w:eastAsia="es-CO"/>
-        </w:rPr>
-        <w:t>Módulo de Proveedores (PROVEEDOR.cpp)</w:t>
-      </w:r>
-    </w:p>
-    <w:p>
-      <w:pPr>
-        <w:numPr>
-          <w:ilvl w:val="0"/>
-          <w:numId w:val="2"/>
-        </w:numPr>
-        <w:spacing w:before="100" w:beforeAutospacing="1" w:after="100" w:afterAutospacing="1" w:line="240" w:lineRule="auto"/>
-        <w:rPr>
-          <w:rFonts w:ascii="Arial" w:eastAsia="Times New Roman" w:hAnsi="Arial" w:cs="Arial"/>
-          <w:lang w:eastAsia="es-CO"/>
-        </w:rPr>
-      </w:pPr>
-      <w:r>
-        <w:rPr>
-          <w:rFonts w:ascii="Arial" w:eastAsia="Times New Roman" w:hAnsi="Arial" w:cs="Arial"/>
-          <w:b/>
-          <w:bCs/>
-          <w:lang w:eastAsia="es-CO"/>
-        </w:rPr>
-        <w:t>Crearproveedor</w:t>
-      </w:r>
-      <w:r>
-        <w:rPr>
-          <w:rFonts w:ascii="Arial" w:eastAsia="Times New Roman" w:hAnsi="Arial" w:cs="Arial"/>
-          <w:lang w:eastAsia="es-CO"/>
-        </w:rPr>
-        <w:t>: Gestiona la entrada de datos mediante un bucle que permite registros múltiples. Valida que el ID sea único y permite la cancelación inmediata mediante la palabra clave "CANCELAR".</w:t>
-      </w:r>
-    </w:p>
-    <w:p>
-      <w:pPr>
-        <w:numPr>
-          <w:ilvl w:val="0"/>
-          <w:numId w:val="2"/>
-        </w:numPr>
-        <w:spacing w:before="100" w:beforeAutospacing="1" w:after="100" w:afterAutospacing="1" w:line="240" w:lineRule="auto"/>
-        <w:rPr>
-          <w:rFonts w:ascii="Arial" w:eastAsia="Times New Roman" w:hAnsi="Arial" w:cs="Arial"/>
-          <w:lang w:eastAsia="es-CO"/>
-        </w:rPr>
-      </w:pPr>
-      <w:r>
-        <w:rPr>
-          <w:rFonts w:ascii="Arial" w:eastAsia="Times New Roman" w:hAnsi="Arial" w:cs="Arial"/>
-          <w:b/>
-          <w:bCs/>
-          <w:lang w:eastAsia="es-CO"/>
-        </w:rPr>
-        <w:t>buscarProveedor</w:t>
-      </w:r>
-      <w:r>
-        <w:rPr>
-          <w:rFonts w:ascii="Arial" w:eastAsia="Times New Roman" w:hAnsi="Arial" w:cs="Arial"/>
-          <w:lang w:eastAsia="es-CO"/>
-        </w:rPr>
-        <w:t xml:space="preserve">: Implementa una búsqueda dual. Puede localizar un registro exacto por su </w:t>
-      </w:r>
-      <w:r>
-        <w:rPr>
-          <w:rFonts w:ascii="Arial" w:eastAsia="Times New Roman" w:hAnsi="Arial" w:cs="Arial"/>
-          <w:b/>
-          <w:bCs/>
-          <w:lang w:eastAsia="es-CO"/>
-        </w:rPr>
-        <w:t>ID</w:t>
-      </w:r>
-      <w:r>
-        <w:rPr>
-          <w:rFonts w:ascii="Arial" w:eastAsia="Times New Roman" w:hAnsi="Arial" w:cs="Arial"/>
-          <w:lang w:eastAsia="es-CO"/>
-        </w:rPr>
-        <w:t xml:space="preserve"> o realizar una búsqueda por </w:t>
-      </w:r>
-      <w:r>
-        <w:rPr>
-          <w:rFonts w:ascii="Arial" w:eastAsia="Times New Roman" w:hAnsi="Arial" w:cs="Arial"/>
-          <w:b/>
-          <w:bCs/>
-          <w:lang w:eastAsia="es-CO"/>
-        </w:rPr>
-        <w:t>Nombre</w:t>
-      </w:r>
-      <w:r>
-        <w:rPr>
-          <w:rFonts w:ascii="Arial" w:eastAsia="Times New Roman" w:hAnsi="Arial" w:cs="Arial"/>
-          <w:lang w:eastAsia="es-CO"/>
-        </w:rPr>
-        <w:t>, devolviendo una lista de coincidencias parciales.</w:t>
-      </w:r>
-    </w:p>
-    <w:p>
-      <w:pPr>
-        <w:numPr>
-          <w:ilvl w:val="0"/>
-          <w:numId w:val="2"/>
-        </w:numPr>
-        <w:spacing w:before="100" w:beforeAutospacing="1" w:after="100" w:afterAutospacing="1" w:line="240" w:lineRule="auto"/>
-        <w:rPr>
-          <w:rFonts w:ascii="Arial" w:eastAsia="Times New Roman" w:hAnsi="Arial" w:cs="Arial"/>
-          <w:lang w:eastAsia="es-CO"/>
-        </w:rPr>
-      </w:pPr>
-      <w:r>
-        <w:rPr>
-          <w:rFonts w:ascii="Arial" w:eastAsia="Times New Roman" w:hAnsi="Arial" w:cs="Arial"/>
-          <w:b/>
-          <w:bCs/>
-          <w:lang w:eastAsia="es-CO"/>
-        </w:rPr>
-        <w:t>editarProveedor</w:t>
-      </w:r>
-      <w:r>
-        <w:rPr>
-          <w:rFonts w:ascii="Arial" w:eastAsia="Times New Roman" w:hAnsi="Arial" w:cs="Arial"/>
-          <w:lang w:eastAsia="es-CO"/>
-        </w:rPr>
-        <w:t>: Localiza el registro en el archivo binario y permite modificar campos específicos, sobrescribiendo únicamente la sección necesaria del archivo para mantener la integridad.</w:t>
-      </w:r>
-    </w:p>
-    <w:p>
-      <w:pPr>
-        <w:spacing w:before="100" w:beforeAutospacing="1" w:after="100" w:afterAutospacing="1" w:line="240" w:lineRule="auto"/>
-        <w:outlineLvl w:val="4"/>
-        <w:rPr>
-          <w:rFonts w:ascii="Arial" w:eastAsia="Times New Roman" w:hAnsi="Arial" w:cs="Arial"/>
-          <w:b/>
-          <w:bCs/>
-          <w:lang w:eastAsia="es-CO"/>
-        </w:rPr>
-      </w:pPr>
-      <w:r>
-        <w:rPr>
-          <w:rFonts w:ascii="Arial" w:eastAsia="Times New Roman" w:hAnsi="Arial" w:cs="Arial"/>
-          <w:b/>
-          <w:bCs/>
-          <w:lang w:eastAsia="es-CO"/>
-        </w:rPr>
-        <w:t>Módulo de Transacciones (TRANSACCION.cpp)</w:t>
-      </w:r>
-    </w:p>
-    <w:p>
-      <w:pPr>
-        <w:numPr>
-          <w:ilvl w:val="0"/>
-          <w:numId w:val="3"/>
-        </w:numPr>
-        <w:spacing w:before="100" w:beforeAutospacing="1" w:after="100" w:afterAutospacing="1" w:line="240" w:lineRule="auto"/>
-        <w:rPr>
-          <w:rFonts w:ascii="Arial" w:eastAsia="Times New Roman" w:hAnsi="Arial" w:cs="Arial"/>
-          <w:lang w:eastAsia="es-CO"/>
-        </w:rPr>
-      </w:pPr>
-      <w:r>
-        <w:rPr>
-          <w:rFonts w:ascii="Arial" w:eastAsia="Times New Roman" w:hAnsi="Arial" w:cs="Arial"/>
-          <w:b/>
-          <w:bCs/>
-          <w:lang w:eastAsia="es-CO"/>
-        </w:rPr>
-        <w:t>venta</w:t>
-      </w:r>
-      <w:r>
-        <w:rPr>
-          <w:rFonts w:ascii="Arial" w:eastAsia="Times New Roman" w:hAnsi="Arial" w:cs="Arial"/>
-          <w:lang w:eastAsia="es-CO"/>
-        </w:rPr>
-        <w:t>: Es la función más compleja. Realiza tres tareas críticas:</w:t>
-      </w:r>
-    </w:p>
-    <w:p>
-      <w:pPr>
-        <w:numPr>
-          <w:ilvl w:val="1"/>
-          <w:numId w:val="3"/>
-        </w:numPr>
-        <w:spacing w:before="100" w:beforeAutospacing="1" w:after="100" w:afterAutospacing="1" w:line="240" w:lineRule="auto"/>
-        <w:rPr>
-          <w:rFonts w:ascii="Arial" w:eastAsia="Times New Roman" w:hAnsi="Arial" w:cs="Arial"/>
-          <w:lang w:eastAsia="es-CO"/>
-        </w:rPr>
-      </w:pPr>
-      <w:r>
-        <w:rPr>
-          <w:rFonts w:ascii="Arial" w:eastAsia="Times New Roman" w:hAnsi="Arial" w:cs="Arial"/>
-          <w:lang w:eastAsia="es-CO"/>
-        </w:rPr>
-        <w:t>Valida la existencia del cliente.</w:t>
-      </w:r>
-    </w:p>
-    <w:p>
-      <w:pPr>
-        <w:numPr>
-          <w:ilvl w:val="1"/>
-          <w:numId w:val="3"/>
-        </w:numPr>
-        <w:spacing w:before="100" w:beforeAutospacing="1" w:after="100" w:afterAutospacing="1" w:line="240" w:lineRule="auto"/>
-        <w:rPr>
-          <w:rFonts w:ascii="Arial" w:eastAsia="Times New Roman" w:hAnsi="Arial" w:cs="Arial"/>
-          <w:lang w:eastAsia="es-CO"/>
-        </w:rPr>
-      </w:pPr>
-      <w:r>
-        <w:rPr>
-          <w:rFonts w:ascii="Arial" w:eastAsia="Times New Roman" w:hAnsi="Arial" w:cs="Arial"/>
-          <w:lang w:eastAsia="es-CO"/>
-        </w:rPr>
-        <w:t>Verifica mediante la función validarStock si hay existencias suficientes.</w:t>
-      </w:r>
-    </w:p>
-    <w:p>
-      <w:pPr>
-        <w:numPr>
-          <w:ilvl w:val="1"/>
-          <w:numId w:val="3"/>
-        </w:numPr>
-        <w:spacing w:before="100" w:beforeAutospacing="1" w:after="100" w:afterAutospacing="1" w:line="240" w:lineRule="auto"/>
-        <w:rPr>
-          <w:rFonts w:ascii="Arial" w:eastAsia="Times New Roman" w:hAnsi="Arial" w:cs="Arial"/>
-          <w:lang w:eastAsia="es-CO"/>
-        </w:rPr>
-      </w:pPr>
-      <w:r>
-        <w:rPr>
-          <w:rFonts w:ascii="Arial" w:eastAsia="Times New Roman" w:hAnsi="Arial" w:cs="Arial"/>
-          <w:lang w:eastAsia="es-CO"/>
-        </w:rPr>
-        <w:t>Actualiza el archivo de productos para restar el stock vendido y genera un registro en el histórico de transacciones.</w:t>
-      </w:r>
-    </w:p>
-    <w:p>
-      <w:pPr>
-        <w:numPr>
-          <w:ilvl w:val="0"/>
-          <w:numId w:val="3"/>
-        </w:numPr>
-        <w:spacing w:before="100" w:beforeAutospacing="1" w:after="100" w:afterAutospacing="1" w:line="240" w:lineRule="auto"/>
-        <w:rPr>
-          <w:rFonts w:ascii="Arial" w:eastAsia="Times New Roman" w:hAnsi="Arial" w:cs="Arial"/>
-          <w:lang w:eastAsia="es-CO"/>
-        </w:rPr>
-      </w:pPr>
-      <w:r>
-        <w:rPr>
-          <w:rFonts w:ascii="Arial" w:eastAsia="Times New Roman" w:hAnsi="Arial" w:cs="Arial"/>
-          <w:b/>
-          <w:bCs/>
-          <w:lang w:eastAsia="es-CO"/>
-        </w:rPr>
-        <w:t>compra</w:t>
-      </w:r>
-      <w:r>
-        <w:rPr>
-          <w:rFonts w:ascii="Arial" w:eastAsia="Times New Roman" w:hAnsi="Arial" w:cs="Arial"/>
-          <w:lang w:eastAsia="es-CO"/>
-        </w:rPr>
-        <w:t>: Funciona de forma inversa a la venta, incrementando el stock de productos tras validar la existencia de un proveedor activo.</w:t>
-      </w:r>
-    </w:p>
-    <w:p>
-      <w:pPr>
-        <w:numPr>
-          <w:ilvl w:val="0"/>
-          <w:numId w:val="3"/>
-        </w:numPr>
-        <w:spacing w:before="100" w:beforeAutospacing="1" w:after="100" w:afterAutospacing="1" w:line="240" w:lineRule="auto"/>
-        <w:rPr>
-          <w:rFonts w:ascii="Arial" w:eastAsia="Times New Roman" w:hAnsi="Arial" w:cs="Arial"/>
-          <w:lang w:eastAsia="es-CO"/>
-        </w:rPr>
-      </w:pPr>
-      <w:r>
-        <w:rPr>
-          <w:rFonts w:ascii="Arial" w:eastAsia="Times New Roman" w:hAnsi="Arial" w:cs="Arial"/>
-          <w:b/>
-          <w:bCs/>
-          <w:lang w:eastAsia="es-CO"/>
-        </w:rPr>
-        <w:t>listartransaccion</w:t>
-      </w:r>
-      <w:r>
-        <w:rPr>
-          <w:rFonts w:ascii="Arial" w:eastAsia="Times New Roman" w:hAnsi="Arial" w:cs="Arial"/>
-          <w:lang w:eastAsia="es-CO"/>
-        </w:rPr>
-        <w:t>: Recorre el archivo de transacciones y, de forma anidada, busca los detalles en el archivo de Productoventa para mostrar un desglose completo de cada operación.</w:t>
-      </w:r>
-    </w:p>
-    <w:p>
-      <w:pPr>
-        <w:spacing w:before="100" w:beforeAutospacing="1" w:after="100" w:afterAutospacing="1" w:line="240" w:lineRule="auto"/>
-        <w:outlineLvl w:val="4"/>
-        <w:rPr>
-          <w:rFonts w:ascii="Arial" w:eastAsia="Times New Roman" w:hAnsi="Arial" w:cs="Arial"/>
-          <w:b/>
-          <w:bCs/>
-          <w:lang w:eastAsia="es-CO"/>
-        </w:rPr>
-      </w:pPr>
-      <w:r>
-        <w:rPr>
-          <w:rFonts w:ascii="Arial" w:eastAsia="Times New Roman" w:hAnsi="Arial" w:cs="Arial"/>
-          <w:b/>
-          <w:bCs/>
-          <w:lang w:eastAsia="es-CO"/>
-        </w:rPr>
-        <w:t>Módulo de Validación (VALIDACIONES.cpp)</w:t>
-      </w:r>
-    </w:p>
-    <w:p>
-      <w:pPr>
-        <w:numPr>
-          <w:ilvl w:val="0"/>
-          <w:numId w:val="4"/>
-        </w:numPr>
-        <w:spacing w:before="100" w:beforeAutospacing="1" w:after="100" w:afterAutospacing="1" w:line="240" w:lineRule="auto"/>
-        <w:rPr>
-          <w:rFonts w:ascii="Arial" w:eastAsia="Times New Roman" w:hAnsi="Arial" w:cs="Arial"/>
-          <w:lang w:eastAsia="es-CO"/>
-        </w:rPr>
-      </w:pPr>
-      <w:r>
-        <w:rPr>
-          <w:rFonts w:ascii="Arial" w:eastAsia="Times New Roman" w:hAnsi="Arial" w:cs="Arial"/>
-          <w:b/>
-          <w:bCs/>
-          <w:lang w:eastAsia="es-CO"/>
-        </w:rPr>
-        <w:lastRenderedPageBreak/>
-        <w:t>esNumero y convertirAEntero</w:t>
-      </w:r>
-      <w:r>
-        <w:rPr>
-          <w:rFonts w:ascii="Arial" w:eastAsia="Times New Roman" w:hAnsi="Arial" w:cs="Arial"/>
-          <w:lang w:eastAsia="es-CO"/>
-        </w:rPr>
-        <w:t>: Filtros de seguridad que aseguran que las entradas destinadas a cálculos numéricos no contengan caracteres alfabéticos.</w:t>
-      </w:r>
-    </w:p>
-    <w:p>
-      <w:pPr>
-        <w:numPr>
-          <w:ilvl w:val="0"/>
-          <w:numId w:val="4"/>
-        </w:numPr>
-        <w:spacing w:before="100" w:beforeAutospacing="1" w:after="100" w:afterAutospacing="1" w:line="240" w:lineRule="auto"/>
-        <w:rPr>
-          <w:rFonts w:ascii="Arial" w:eastAsia="Times New Roman" w:hAnsi="Arial" w:cs="Arial"/>
-          <w:lang w:eastAsia="es-CO"/>
-        </w:rPr>
-      </w:pPr>
-      <w:r>
-        <w:rPr>
-          <w:rFonts w:ascii="Arial" w:eastAsia="Times New Roman" w:hAnsi="Arial" w:cs="Arial"/>
-          <w:b/>
-          <w:bCs/>
-          <w:lang w:eastAsia="es-CO"/>
-        </w:rPr>
-        <w:t>opcionSN</w:t>
-      </w:r>
-      <w:r>
-        <w:rPr>
-          <w:rFonts w:ascii="Arial" w:eastAsia="Times New Roman" w:hAnsi="Arial" w:cs="Arial"/>
-          <w:lang w:eastAsia="es-CO"/>
-        </w:rPr>
-        <w:t>: Estandariza las respuestas de confirmación del usuario, aceptando variantes como "S", "s", "Si" o "SI".</w:t>
-      </w:r>
-    </w:p>
-    <w:p>
-      <w:pPr>
-        <w:spacing w:after="0" w:line="240" w:lineRule="auto"/>
-        <w:rPr>
-          <w:rFonts w:ascii="Arial" w:eastAsia="Times New Roman" w:hAnsi="Arial" w:cs="Arial"/>
-          <w:lang w:eastAsia="es-CO"/>
-        </w:rPr>
-      </w:pPr>
-      <w:r>
-        <w:rPr>
-          <w:rFonts w:ascii="Arial" w:eastAsia="Times New Roman" w:hAnsi="Arial" w:cs="Arial"/>
-          <w:lang w:eastAsia="es-CO"/>
-        </w:rPr>
-        <w:pict w14:anchorId="597B96B3">
-          <v:rect id="_x0000_i1026" style="width:0;height:1.5pt" o:hralign="center" o:hrstd="t" o:hr="t" fillcolor="#a0a0a0" stroked="f"/>
-        </w:pict>
-      </w:r>
-    </w:p>
-    <w:p>
-      <w:pPr>
-        <w:spacing w:before="100" w:beforeAutospacing="1" w:after="100" w:afterAutospacing="1" w:line="240" w:lineRule="auto"/>
-        <w:outlineLvl w:val="3"/>
-        <w:rPr>
-          <w:rFonts w:ascii="Arial" w:eastAsia="Times New Roman" w:hAnsi="Arial" w:cs="Arial"/>
-          <w:b/>
-          <w:bCs/>
-          <w:lang w:eastAsia="es-CO"/>
-        </w:rPr>
-      </w:pPr>
-      <w:r>
-        <w:rPr>
-          <w:rFonts w:ascii="Arial" w:eastAsia="Times New Roman" w:hAnsi="Arial" w:cs="Arial"/>
-          <w:b/>
-          <w:bCs/>
-          <w:lang w:eastAsia="es-CO"/>
-        </w:rPr>
-        <w:t>3. ORGANIZACIÓN DEL FLUJO DE DATOS</w:t>
-      </w:r>
-    </w:p>
-    <w:p>
-      <w:pPr>
-        <w:spacing w:before="100" w:beforeAutospacing="1" w:after="100" w:afterAutospacing="1" w:line="240" w:lineRule="auto"/>
-        <w:rPr>
-          <w:rFonts w:ascii="Arial" w:eastAsia="Times New Roman" w:hAnsi="Arial" w:cs="Arial"/>
-          <w:lang w:eastAsia="es-CO"/>
-        </w:rPr>
-      </w:pPr>
-      <w:r>
-        <w:rPr>
-          <w:rFonts w:ascii="Arial" w:eastAsia="Times New Roman" w:hAnsi="Arial" w:cs="Arial"/>
-          <w:lang w:eastAsia="es-CO"/>
-        </w:rPr>
-        <w:t xml:space="preserve">El programa sigue un flujo jerárquico controlado por el archivo </w:t>
-      </w:r>
-      <w:r>
-        <w:rPr>
-          <w:rFonts w:ascii="Arial" w:eastAsia="Times New Roman" w:hAnsi="Arial" w:cs="Arial"/>
-          <w:b/>
-          <w:bCs/>
-          <w:lang w:eastAsia="es-CO"/>
-        </w:rPr>
-        <w:t>proyectov5.cpp</w:t>
-      </w:r>
+        <w:outlineLvl w:val="2"/>
+        <w:rPr>
+          <w:rFonts w:ascii="Arial" w:eastAsia="Times New Roman" w:hAnsi="Arial" w:cs="Arial"/>
+          <w:lang w:eastAsia="es-CO"/>
+        </w:rPr>
+      </w:pPr>
+      <w:r>
+        <w:rPr>
+          <w:rFonts w:ascii="Arial" w:eastAsia="Times New Roman" w:hAnsi="Arial" w:cs="Arial"/>
+          <w:lang w:eastAsia="es-CO"/>
+        </w:rPr>
+        <w:t xml:space="preserve">El código luego imprimirá el menú que se vería </w:t>
+      </w:r>
+      <w:proofErr w:type="spellStart"/>
+      <w:r>
+        <w:rPr>
+          <w:rFonts w:ascii="Arial" w:eastAsia="Times New Roman" w:hAnsi="Arial" w:cs="Arial"/>
+          <w:lang w:eastAsia="es-CO"/>
+        </w:rPr>
+        <w:t>asi</w:t>
+      </w:r>
+      <w:proofErr w:type="spellEnd"/>
       <w:r>
         <w:rPr>
           <w:rFonts w:ascii="Arial" w:eastAsia="Times New Roman" w:hAnsi="Arial" w:cs="Arial"/>
@@ -660,297 +157,15 @@
         </w:rPr>
         <w:t>:</w:t>
       </w:r>
-    </w:p>
-    <w:p>
-      <w:pPr>
-        <w:numPr>
-          <w:ilvl w:val="0"/>
-          <w:numId w:val="5"/>
-        </w:numPr>
-        <w:spacing w:before="100" w:beforeAutospacing="1" w:after="100" w:afterAutospacing="1" w:line="240" w:lineRule="auto"/>
-        <w:rPr>
-          <w:rFonts w:ascii="Arial" w:eastAsia="Times New Roman" w:hAnsi="Arial" w:cs="Arial"/>
-          <w:lang w:eastAsia="es-CO"/>
-        </w:rPr>
-      </w:pPr>
-      <w:r>
-        <w:rPr>
-          <w:rFonts w:ascii="Arial" w:eastAsia="Times New Roman" w:hAnsi="Arial" w:cs="Arial"/>
-          <w:b/>
-          <w:bCs/>
-          <w:lang w:eastAsia="es-CO"/>
-        </w:rPr>
-        <w:t>Arranque</w:t>
-      </w:r>
-      <w:r>
-        <w:rPr>
-          <w:rFonts w:ascii="Arial" w:eastAsia="Times New Roman" w:hAnsi="Arial" w:cs="Arial"/>
-          <w:lang w:eastAsia="es-CO"/>
-        </w:rPr>
-        <w:t>: Se abren los flujos de archivos (fstream) en modo binario y se cargan los encabezados a memoria.</w:t>
-      </w:r>
-    </w:p>
-    <w:p>
-      <w:pPr>
-        <w:numPr>
-          <w:ilvl w:val="0"/>
-          <w:numId w:val="5"/>
-        </w:numPr>
-        <w:spacing w:before="100" w:beforeAutospacing="1" w:after="100" w:afterAutospacing="1" w:line="240" w:lineRule="auto"/>
-        <w:rPr>
-          <w:rFonts w:ascii="Arial" w:eastAsia="Times New Roman" w:hAnsi="Arial" w:cs="Arial"/>
-          <w:lang w:eastAsia="es-CO"/>
-        </w:rPr>
-      </w:pPr>
-      <w:r>
-        <w:rPr>
-          <w:rFonts w:ascii="Arial" w:eastAsia="Times New Roman" w:hAnsi="Arial" w:cs="Arial"/>
-          <w:b/>
-          <w:bCs/>
-          <w:lang w:eastAsia="es-CO"/>
-        </w:rPr>
-        <w:t>Operación</w:t>
-      </w:r>
-      <w:r>
-        <w:rPr>
-          <w:rFonts w:ascii="Arial" w:eastAsia="Times New Roman" w:hAnsi="Arial" w:cs="Arial"/>
-          <w:lang w:eastAsia="es-CO"/>
-        </w:rPr>
-        <w:t>: El main actúa como despachador, enviando al usuario a los menús específicos de cada clase.</w:t>
-      </w:r>
-    </w:p>
-    <w:p>
-      <w:pPr>
-        <w:numPr>
-          <w:ilvl w:val="0"/>
-          <w:numId w:val="5"/>
-        </w:numPr>
-        <w:spacing w:before="100" w:beforeAutospacing="1" w:after="100" w:afterAutospacing="1" w:line="240" w:lineRule="auto"/>
-        <w:rPr>
-          <w:rFonts w:ascii="Arial" w:eastAsia="Times New Roman" w:hAnsi="Arial" w:cs="Arial"/>
-          <w:lang w:eastAsia="es-CO"/>
-        </w:rPr>
-      </w:pPr>
-      <w:r>
-        <w:rPr>
-          <w:rFonts w:ascii="Arial" w:eastAsia="Times New Roman" w:hAnsi="Arial" w:cs="Arial"/>
-          <w:b/>
-          <w:bCs/>
-          <w:lang w:eastAsia="es-CO"/>
-        </w:rPr>
-        <w:t>Cierre Seguro</w:t>
-      </w:r>
-      <w:r>
-        <w:rPr>
-          <w:rFonts w:ascii="Arial" w:eastAsia="Times New Roman" w:hAnsi="Arial" w:cs="Arial"/>
-          <w:lang w:eastAsia="es-CO"/>
-        </w:rPr>
-        <w:t>: Al seleccionar "Salir", el sistema ejecuta la función actualizarheader. Esto asegura que el conteo de registros se guarde correctamente en el disco antes de cerrar los archivos, evitando la corrupción de datos.</w:t>
-      </w:r>
-    </w:p>
-    <w:p>
-      <w:pPr>
-        <w:spacing w:after="0" w:line="240" w:lineRule="auto"/>
-        <w:rPr>
-          <w:rFonts w:ascii="Arial" w:eastAsia="Times New Roman" w:hAnsi="Arial" w:cs="Arial"/>
-          <w:sz w:val="28"/>
-          <w:szCs w:val="28"/>
-          <w:lang w:eastAsia="es-CO"/>
-        </w:rPr>
-      </w:pPr>
-      <w:r>
-        <w:rPr>
-          <w:rFonts w:ascii="Arial" w:eastAsia="Times New Roman" w:hAnsi="Arial" w:cs="Arial"/>
-          <w:sz w:val="28"/>
-          <w:szCs w:val="28"/>
-          <w:lang w:eastAsia="es-CO"/>
-        </w:rPr>
-        <w:pict w14:anchorId="755138BA">
-          <v:rect id="_x0000_i1027" style="width:0;height:1.5pt" o:hralign="center" o:hrstd="t" o:hr="t" fillcolor="#a0a0a0" stroked="f"/>
-        </w:pict>
-      </w:r>
-    </w:p>
-    <w:p>
-      <w:pPr>
-        <w:spacing w:before="100" w:beforeAutospacing="1" w:after="100" w:afterAutospacing="1" w:line="240" w:lineRule="auto"/>
-        <w:outlineLvl w:val="3"/>
-        <w:rPr>
-          <w:rFonts w:ascii="Arial" w:eastAsia="Times New Roman" w:hAnsi="Arial" w:cs="Arial"/>
-          <w:b/>
-          <w:bCs/>
-          <w:lang w:eastAsia="es-CO"/>
-        </w:rPr>
-      </w:pPr>
-      <w:r>
-        <w:rPr>
-          <w:rFonts w:ascii="Arial" w:eastAsia="Times New Roman" w:hAnsi="Arial" w:cs="Arial"/>
-          <w:b/>
-          <w:bCs/>
-          <w:lang w:eastAsia="es-CO"/>
-        </w:rPr>
-        <w:t>4. INSTRUCCIONES DE OPERACIÓN</w:t>
-      </w:r>
-    </w:p>
-    <w:p>
-      <w:pPr>
-        <w:numPr>
-          <w:ilvl w:val="0"/>
-          <w:numId w:val="6"/>
-        </w:numPr>
-        <w:spacing w:before="100" w:beforeAutospacing="1" w:after="100" w:afterAutospacing="1" w:line="240" w:lineRule="auto"/>
-        <w:rPr>
-          <w:rFonts w:ascii="Arial" w:eastAsia="Times New Roman" w:hAnsi="Arial" w:cs="Arial"/>
-          <w:lang w:eastAsia="es-CO"/>
-        </w:rPr>
-      </w:pPr>
-      <w:r>
-        <w:rPr>
-          <w:rFonts w:ascii="Arial" w:eastAsia="Times New Roman" w:hAnsi="Arial" w:cs="Arial"/>
-          <w:b/>
-          <w:bCs/>
-          <w:lang w:eastAsia="es-CO"/>
-        </w:rPr>
-        <w:t>Registro de Datos</w:t>
-      </w:r>
-      <w:r>
-        <w:rPr>
-          <w:rFonts w:ascii="Arial" w:eastAsia="Times New Roman" w:hAnsi="Arial" w:cs="Arial"/>
-          <w:lang w:eastAsia="es-CO"/>
-        </w:rPr>
-        <w:t xml:space="preserve">: Al ingresar nombres o descripciones, el sistema admite espacios. Si desea interrumpir cualquier proceso, ingrese </w:t>
-      </w:r>
-      <w:r>
-        <w:rPr>
-          <w:rFonts w:ascii="Arial" w:eastAsia="Times New Roman" w:hAnsi="Arial" w:cs="Arial"/>
-          <w:b/>
-          <w:bCs/>
-          <w:lang w:eastAsia="es-CO"/>
-        </w:rPr>
-        <w:t>"0"</w:t>
-      </w:r>
-      <w:r>
-        <w:rPr>
-          <w:rFonts w:ascii="Arial" w:eastAsia="Times New Roman" w:hAnsi="Arial" w:cs="Arial"/>
-          <w:lang w:eastAsia="es-CO"/>
-        </w:rPr>
-        <w:t xml:space="preserve"> o </w:t>
-      </w:r>
-      <w:r>
-        <w:rPr>
-          <w:rFonts w:ascii="Arial" w:eastAsia="Times New Roman" w:hAnsi="Arial" w:cs="Arial"/>
-          <w:b/>
-          <w:bCs/>
-          <w:lang w:eastAsia="es-CO"/>
-        </w:rPr>
-        <w:t>"CANCELAR"</w:t>
-      </w:r>
-      <w:r>
-        <w:rPr>
-          <w:rFonts w:ascii="Arial" w:eastAsia="Times New Roman" w:hAnsi="Arial" w:cs="Arial"/>
-          <w:lang w:eastAsia="es-CO"/>
-        </w:rPr>
-        <w:t xml:space="preserve"> cuando se le solicite un dato clave.</w:t>
-      </w:r>
-    </w:p>
-    <w:p>
-      <w:pPr>
-        <w:numPr>
-          <w:ilvl w:val="0"/>
-          <w:numId w:val="6"/>
-        </w:numPr>
-        <w:spacing w:before="100" w:beforeAutospacing="1" w:after="100" w:afterAutospacing="1" w:line="240" w:lineRule="auto"/>
-        <w:rPr>
-          <w:rFonts w:ascii="Arial" w:eastAsia="Times New Roman" w:hAnsi="Arial" w:cs="Arial"/>
-          <w:lang w:eastAsia="es-CO"/>
-        </w:rPr>
-      </w:pPr>
-      <w:r>
-        <w:rPr>
-          <w:rFonts w:ascii="Arial" w:eastAsia="Times New Roman" w:hAnsi="Arial" w:cs="Arial"/>
-          <w:b/>
-          <w:bCs/>
-          <w:lang w:eastAsia="es-CO"/>
-        </w:rPr>
-        <w:t>Gestión de Stock</w:t>
-      </w:r>
-      <w:r>
-        <w:rPr>
-          <w:rFonts w:ascii="Arial" w:eastAsia="Times New Roman" w:hAnsi="Arial" w:cs="Arial"/>
-          <w:lang w:eastAsia="es-CO"/>
-        </w:rPr>
-        <w:t xml:space="preserve">: No es necesario editar el producto manualmente tras una venta; el sistema de </w:t>
-      </w:r>
-      <w:r>
-        <w:rPr>
-          <w:rFonts w:ascii="Arial" w:eastAsia="Times New Roman" w:hAnsi="Arial" w:cs="Arial"/>
-          <w:b/>
-          <w:bCs/>
-          <w:lang w:eastAsia="es-CO"/>
-        </w:rPr>
-        <w:t>Transacciones</w:t>
-      </w:r>
-      <w:r>
-        <w:rPr>
-          <w:rFonts w:ascii="Arial" w:eastAsia="Times New Roman" w:hAnsi="Arial" w:cs="Arial"/>
-          <w:lang w:eastAsia="es-CO"/>
-        </w:rPr>
-        <w:t xml:space="preserve"> actualiza automáticamente las existencias para asegurar que la información sea siempre fidedigna.</w:t>
-      </w:r>
-    </w:p>
-    <w:p>
-      <w:pPr>
-        <w:numPr>
-          <w:ilvl w:val="0"/>
-          <w:numId w:val="6"/>
-        </w:numPr>
-        <w:spacing w:before="100" w:beforeAutospacing="1" w:after="100" w:afterAutospacing="1" w:line="240" w:lineRule="auto"/>
-        <w:rPr>
-          <w:rFonts w:ascii="Arial" w:eastAsia="Times New Roman" w:hAnsi="Arial" w:cs="Arial"/>
-          <w:lang w:eastAsia="es-CO"/>
-        </w:rPr>
-      </w:pPr>
-      <w:r>
-        <w:rPr>
-          <w:rFonts w:ascii="Arial" w:eastAsia="Times New Roman" w:hAnsi="Arial" w:cs="Arial"/>
-          <w:b/>
-          <w:bCs/>
-          <w:lang w:eastAsia="es-CO"/>
-        </w:rPr>
-        <w:t>Búsquedas</w:t>
-      </w:r>
-      <w:r>
-        <w:rPr>
-          <w:rFonts w:ascii="Arial" w:eastAsia="Times New Roman" w:hAnsi="Arial" w:cs="Arial"/>
-          <w:lang w:eastAsia="es-CO"/>
-        </w:rPr>
-        <w:t>: Si no recuerda el ID exacto, utilice la búsqueda por nombre. El sistema le presentará una lista numerada de opciones encontradas para que usted seleccione la correcta.</w:t>
-      </w:r>
-      <w:r>
-        <w:rPr>
-          <w:rFonts w:ascii="Arial" w:eastAsia="Times New Roman" w:hAnsi="Arial" w:cs="Arial"/>
+      <w:r>
+        <w:rPr>
+          <w:rFonts w:ascii="Arial" w:eastAsia="Times New Roman" w:hAnsi="Arial" w:cs="Arial"/>
+          <w:b/>
+          <w:bCs/>
           <w:lang w:eastAsia="es-CO"/>
         </w:rPr>
         <w:br/>
       </w:r>
-    </w:p>
-    <w:p>
-      <w:pPr>
-        <w:spacing w:before="100" w:beforeAutospacing="1" w:after="100" w:afterAutospacing="1" w:line="240" w:lineRule="auto"/>
-        <w:ind w:left="360"/>
-        <w:rPr>
-          <w:rFonts w:ascii="Arial" w:eastAsia="Times New Roman" w:hAnsi="Arial" w:cs="Arial"/>
-          <w:lang w:eastAsia="es-CO"/>
-        </w:rPr>
-      </w:pPr>
-      <w:r>
-        <w:rPr>
-          <w:rFonts w:ascii="Arial" w:eastAsia="Times New Roman" w:hAnsi="Arial" w:cs="Arial"/>
-          <w:b/>
-          <w:bCs/>
-          <w:lang w:eastAsia="es-CO"/>
-        </w:rPr>
-        <w:t>Aquí algunas fotos del funcionamiento del código</w:t>
-      </w:r>
       <w:r>
         <w:rPr>
           <w:rFonts w:ascii="Arial" w:eastAsia="Times New Roman" w:hAnsi="Arial" w:cs="Arial"/>
@@ -965,21 +180,11 @@
           <w:rFonts w:ascii="Arial" w:eastAsia="Times New Roman" w:hAnsi="Arial" w:cs="Arial"/>
           <w:b/>
           <w:bCs/>
-          <w:lang w:eastAsia="es-CO"/>
-        </w:rPr>
-        <w:br/>
-      </w:r>
-      <w:r>
-        <w:rPr>
-          <w:rFonts w:ascii="Arial" w:eastAsia="Times New Roman" w:hAnsi="Arial" w:cs="Arial"/>
-          <w:b/>
-          <w:bCs/>
           <w:noProof/>
           <w:lang w:eastAsia="es-CO"/>
         </w:rPr>
-        <w:lastRenderedPageBreak/>
         <w:drawing>
-          <wp:inline distT="0" distB="0" distL="0" distR="0" wp14:anchorId="05C1E95E" wp14:editId="4A221BEA">
+          <wp:inline distT="0" distB="0" distL="0" distR="0" wp14:anchorId="041BDEA9" wp14:editId="3C39B676">
             <wp:extent cx="5326380" cy="2346960"/>
             <wp:effectExtent l="0" t="0" r="7620" b="0"/>
             <wp:docPr id="514382580" name="Picture 2"/>
@@ -1032,11 +237,73 @@
           <w:rFonts w:ascii="Arial" w:eastAsia="Times New Roman" w:hAnsi="Arial" w:cs="Arial"/>
           <w:b/>
           <w:bCs/>
+          <w:lang w:eastAsia="es-CO"/>
+        </w:rPr>
+        <w:br/>
+      </w:r>
+      <w:r>
+        <w:rPr>
+          <w:rFonts w:ascii="Arial" w:eastAsia="Times New Roman" w:hAnsi="Arial" w:cs="Arial"/>
+          <w:b/>
+          <w:bCs/>
+          <w:lang w:eastAsia="es-CO"/>
+        </w:rPr>
+        <w:br/>
+      </w:r>
+      <w:r>
+        <w:rPr>
+          <w:rFonts w:ascii="Arial" w:eastAsia="Times New Roman" w:hAnsi="Arial" w:cs="Arial"/>
+          <w:lang w:eastAsia="es-CO"/>
+        </w:rPr>
+        <w:t>El usuario podrá escoger que opción utilizar y para que</w:t>
+      </w:r>
+    </w:p>
+    <w:p>
+      <w:pPr>
+        <w:spacing w:before="100" w:beforeAutospacing="1" w:after="100" w:afterAutospacing="1" w:line="240" w:lineRule="auto"/>
+        <w:outlineLvl w:val="2"/>
+        <w:rPr>
+          <w:rFonts w:ascii="Arial" w:eastAsia="Times New Roman" w:hAnsi="Arial" w:cs="Arial"/>
+          <w:b/>
+          <w:bCs/>
+          <w:lang w:eastAsia="es-CO"/>
+        </w:rPr>
+      </w:pPr>
+      <w:r>
+        <w:rPr>
+          <w:rFonts w:ascii="Arial" w:eastAsia="Times New Roman" w:hAnsi="Arial" w:cs="Arial"/>
+          <w:lang w:eastAsia="es-CO"/>
+        </w:rPr>
+        <w:t>La opción gestión de productos le muestra al usuario la siguiente imagen:</w:t>
+      </w:r>
+      <w:r>
+        <w:rPr>
+          <w:rFonts w:ascii="Arial" w:eastAsia="Times New Roman" w:hAnsi="Arial" w:cs="Arial"/>
+          <w:b/>
+          <w:bCs/>
+          <w:lang w:eastAsia="es-CO"/>
+        </w:rPr>
+        <w:br/>
+      </w:r>
+      <w:r>
+        <w:rPr>
+          <w:rFonts w:ascii="Arial" w:eastAsia="Times New Roman" w:hAnsi="Arial" w:cs="Arial"/>
+          <w:b/>
+          <w:bCs/>
+          <w:lang w:eastAsia="es-CO"/>
+        </w:rPr>
+        <w:br/>
+      </w:r>
+      <w:r>
+        <w:rPr>
+          <w:rFonts w:ascii="Arial" w:eastAsia="Times New Roman" w:hAnsi="Arial" w:cs="Arial"/>
+          <w:b/>
+          <w:bCs/>
           <w:noProof/>
           <w:lang w:eastAsia="es-CO"/>
         </w:rPr>
         <w:drawing>
-          <wp:inline distT="0" distB="0" distL="0" distR="0" wp14:anchorId="50569348" wp14:editId="31108A24">
+          <wp:inline distT="0" distB="0" distL="0" distR="0" wp14:anchorId="49962643" wp14:editId="2046B999">
             <wp:extent cx="5379720" cy="2240280"/>
             <wp:effectExtent l="0" t="0" r="0" b="7620"/>
             <wp:docPr id="1090009478" name="Picture 3"/>
@@ -1089,12 +356,184 @@
           <w:rFonts w:ascii="Arial" w:eastAsia="Times New Roman" w:hAnsi="Arial" w:cs="Arial"/>
           <w:b/>
           <w:bCs/>
+          <w:lang w:eastAsia="es-CO"/>
+        </w:rPr>
+        <w:br/>
+      </w:r>
+    </w:p>
+    <w:p>
+      <w:pPr>
+        <w:spacing w:before="100" w:beforeAutospacing="1" w:after="100" w:afterAutospacing="1" w:line="240" w:lineRule="auto"/>
+        <w:outlineLvl w:val="2"/>
+        <w:rPr>
+          <w:rFonts w:ascii="Arial" w:eastAsia="Times New Roman" w:hAnsi="Arial" w:cs="Arial"/>
+          <w:b/>
+          <w:bCs/>
+          <w:lang w:eastAsia="es-CO"/>
+        </w:rPr>
+      </w:pPr>
+      <w:r>
+        <w:rPr>
+          <w:rFonts w:ascii="Arial" w:eastAsia="Times New Roman" w:hAnsi="Arial" w:cs="Arial"/>
+          <w:lang w:eastAsia="es-CO"/>
+        </w:rPr>
+        <w:lastRenderedPageBreak/>
+        <w:t xml:space="preserve">El usuario aquí podrá decidir si registrar un nuevo producto, buscarlo, actualizar uno ya existente, actualizar el stock de manera manual, listar todos los productos, o </w:t>
+      </w:r>
+      <w:proofErr w:type="spellStart"/>
+      <w:r>
+        <w:rPr>
+          <w:rFonts w:ascii="Arial" w:eastAsia="Times New Roman" w:hAnsi="Arial" w:cs="Arial"/>
+          <w:lang w:eastAsia="es-CO"/>
+        </w:rPr>
+        <w:t>elminarlo</w:t>
+      </w:r>
+      <w:proofErr w:type="spellEnd"/>
+      <w:r>
+        <w:rPr>
+          <w:rFonts w:ascii="Arial" w:eastAsia="Times New Roman" w:hAnsi="Arial" w:cs="Arial"/>
+          <w:lang w:eastAsia="es-CO"/>
+        </w:rPr>
+        <w:t xml:space="preserve">. Y por </w:t>
+      </w:r>
+      <w:r>
+        <w:rPr>
+          <w:rFonts w:ascii="Arial" w:eastAsia="Times New Roman" w:hAnsi="Arial" w:cs="Arial"/>
+          <w:lang w:eastAsia="es-CO"/>
+        </w:rPr>
+        <w:t>último</w:t>
+      </w:r>
+      <w:r>
+        <w:rPr>
+          <w:rFonts w:ascii="Arial" w:eastAsia="Times New Roman" w:hAnsi="Arial" w:cs="Arial"/>
+          <w:lang w:eastAsia="es-CO"/>
+        </w:rPr>
+        <w:t xml:space="preserve"> la opción que </w:t>
+      </w:r>
+      <w:proofErr w:type="spellStart"/>
+      <w:r>
+        <w:rPr>
+          <w:rFonts w:ascii="Arial" w:eastAsia="Times New Roman" w:hAnsi="Arial" w:cs="Arial"/>
+          <w:lang w:eastAsia="es-CO"/>
+        </w:rPr>
+        <w:t>esta</w:t>
+      </w:r>
+      <w:proofErr w:type="spellEnd"/>
+      <w:r>
+        <w:rPr>
+          <w:rFonts w:ascii="Arial" w:eastAsia="Times New Roman" w:hAnsi="Arial" w:cs="Arial"/>
+          <w:lang w:eastAsia="es-CO"/>
+        </w:rPr>
+        <w:t xml:space="preserve"> en todas las opciones del menú que es volver al menú principal. Para editar un producto, buscarlo, actualizarlo o eliminarlo, debe existir por lo menos un producto </w:t>
+      </w:r>
+      <w:r>
+        <w:rPr>
+          <w:rFonts w:ascii="Arial" w:eastAsia="Times New Roman" w:hAnsi="Arial" w:cs="Arial"/>
+          <w:lang w:eastAsia="es-CO"/>
+        </w:rPr>
+        <w:t xml:space="preserve">, pedirá algunos datos acerca del producto para registrarlo, </w:t>
+      </w:r>
+      <w:r>
+        <w:rPr>
+          <w:rFonts w:ascii="Arial" w:eastAsia="Times New Roman" w:hAnsi="Arial" w:cs="Arial"/>
+          <w:lang w:eastAsia="es-CO"/>
+        </w:rPr>
+        <w:t>el cual debe registrar el usuario manualmente, pero antes de ello debe de Registrar un proveedor.</w:t>
+      </w:r>
+      <w:r>
+        <w:rPr>
+          <w:rFonts w:ascii="Arial" w:eastAsia="Times New Roman" w:hAnsi="Arial" w:cs="Arial"/>
+          <w:lang w:eastAsia="es-CO"/>
+        </w:rPr>
+        <w:br/>
+      </w:r>
+      <w:r>
+        <w:rPr>
+          <w:rFonts w:ascii="Arial" w:eastAsia="Times New Roman" w:hAnsi="Arial" w:cs="Arial"/>
+          <w:lang w:eastAsia="es-CO"/>
+        </w:rPr>
+        <w:br/>
+        <w:t xml:space="preserve">La opción </w:t>
+      </w:r>
+      <w:r>
+        <w:rPr>
+          <w:rFonts w:ascii="Arial" w:eastAsia="Times New Roman" w:hAnsi="Arial" w:cs="Arial"/>
+          <w:lang w:eastAsia="es-CO"/>
+        </w:rPr>
+        <w:t>Gestión de Proveedores</w:t>
+      </w:r>
+      <w:r>
+        <w:rPr>
+          <w:rFonts w:ascii="Arial" w:eastAsia="Times New Roman" w:hAnsi="Arial" w:cs="Arial"/>
+          <w:lang w:eastAsia="es-CO"/>
+        </w:rPr>
+        <w:br/>
+      </w:r>
+      <w:r>
+        <w:rPr>
+          <w:rFonts w:ascii="Arial" w:eastAsia="Times New Roman" w:hAnsi="Arial" w:cs="Arial"/>
+          <w:lang w:eastAsia="es-CO"/>
+        </w:rPr>
+        <w:br/>
+      </w:r>
+      <w:r>
+        <w:rPr>
+          <w:rFonts w:ascii="Arial" w:eastAsia="Times New Roman" w:hAnsi="Arial" w:cs="Arial"/>
+          <w:lang w:eastAsia="es-CO"/>
+        </w:rPr>
+        <w:br/>
+        <w:t>El usuario tiene las mismas funciones que las otras opciones, la diferencia que es con los proveedores, le permitirá registrarlos, buscarlos, actualizarlos, listarlos, eliminarlos o salir, aquí se pedirán algunos datos para poder registrar al proveedor, como su cedula para registrarlos todos diferentes uno del otro</w:t>
+      </w:r>
+      <w:r>
+        <w:rPr>
+          <w:rFonts w:ascii="Arial" w:eastAsia="Times New Roman" w:hAnsi="Arial" w:cs="Arial"/>
+          <w:lang w:eastAsia="es-CO"/>
+        </w:rPr>
+        <w:br/>
+      </w:r>
+      <w:r>
+        <w:rPr>
+          <w:rFonts w:ascii="Arial" w:eastAsia="Times New Roman" w:hAnsi="Arial" w:cs="Arial"/>
+          <w:lang w:eastAsia="es-CO"/>
+        </w:rPr>
+        <w:br/>
+      </w:r>
+      <w:r>
+        <w:rPr>
+          <w:rFonts w:ascii="Arial" w:eastAsia="Times New Roman" w:hAnsi="Arial" w:cs="Arial"/>
+          <w:lang w:eastAsia="es-CO"/>
+        </w:rPr>
+        <w:br/>
+        <w:t>Gestión de clientes</w:t>
+      </w:r>
+      <w:r>
+        <w:rPr>
+          <w:rFonts w:ascii="Arial" w:eastAsia="Times New Roman" w:hAnsi="Arial" w:cs="Arial"/>
+          <w:b/>
+          <w:bCs/>
+          <w:lang w:eastAsia="es-CO"/>
+        </w:rPr>
+        <w:br/>
+      </w:r>
+      <w:r>
+        <w:rPr>
+          <w:rFonts w:ascii="Arial" w:eastAsia="Times New Roman" w:hAnsi="Arial" w:cs="Arial"/>
+          <w:b/>
+          <w:bCs/>
+          <w:lang w:eastAsia="es-CO"/>
+        </w:rPr>
+        <w:br/>
+      </w:r>
+      <w:r>
+        <w:rPr>
+          <w:rFonts w:ascii="Arial" w:eastAsia="Times New Roman" w:hAnsi="Arial" w:cs="Arial"/>
+          <w:b/>
+          <w:bCs/>
           <w:noProof/>
           <w:lang w:eastAsia="es-CO"/>
         </w:rPr>
-        <w:lastRenderedPageBreak/>
         <w:drawing>
-          <wp:inline distT="0" distB="0" distL="0" distR="0" wp14:anchorId="4854EEC7" wp14:editId="602B9BD8">
+          <wp:inline distT="0" distB="0" distL="0" distR="0" wp14:anchorId="67618A32" wp14:editId="23FF9B93">
             <wp:extent cx="5608320" cy="2156460"/>
             <wp:effectExtent l="0" t="0" r="0" b="0"/>
             <wp:docPr id="1317957172" name="Picture 4"/>
@@ -1147,11 +586,62 @@
           <w:rFonts w:ascii="Arial" w:eastAsia="Times New Roman" w:hAnsi="Arial" w:cs="Arial"/>
           <w:b/>
           <w:bCs/>
+          <w:lang w:eastAsia="es-CO"/>
+        </w:rPr>
+        <w:br/>
+      </w:r>
+      <w:r>
+        <w:rPr>
+          <w:rFonts w:ascii="Arial" w:eastAsia="Times New Roman" w:hAnsi="Arial" w:cs="Arial"/>
+          <w:b/>
+          <w:bCs/>
+          <w:lang w:eastAsia="es-CO"/>
+        </w:rPr>
+        <w:br/>
+      </w:r>
+      <w:r>
+        <w:rPr>
+          <w:rFonts w:ascii="Arial" w:eastAsia="Times New Roman" w:hAnsi="Arial" w:cs="Arial"/>
+          <w:b/>
+          <w:bCs/>
+          <w:lang w:eastAsia="es-CO"/>
+        </w:rPr>
+        <w:br/>
+      </w:r>
+      <w:r>
+        <w:rPr>
+          <w:rFonts w:ascii="Arial" w:eastAsia="Times New Roman" w:hAnsi="Arial" w:cs="Arial"/>
+          <w:lang w:eastAsia="es-CO"/>
+        </w:rPr>
+        <w:t>Funciona exactamente igual que la función de proveedor, pide los mismos datos para registrar a los clientes, y hace lo mismo con las demás funciones</w:t>
+      </w:r>
+      <w:r>
+        <w:rPr>
+          <w:rFonts w:ascii="Arial" w:eastAsia="Times New Roman" w:hAnsi="Arial" w:cs="Arial"/>
+          <w:lang w:eastAsia="es-CO"/>
+        </w:rPr>
+        <w:t>, es básicamente una copia de registrar proveedor</w:t>
+      </w:r>
+      <w:r>
+        <w:rPr>
+          <w:rFonts w:ascii="Arial" w:eastAsia="Times New Roman" w:hAnsi="Arial" w:cs="Arial"/>
+          <w:b/>
+          <w:bCs/>
+          <w:lang w:eastAsia="es-CO"/>
+        </w:rPr>
+        <w:br/>
+      </w:r>
+      <w:r>
+        <w:rPr>
+          <w:rFonts w:ascii="Arial" w:eastAsia="Times New Roman" w:hAnsi="Arial" w:cs="Arial"/>
+          <w:b/>
+          <w:bCs/>
           <w:noProof/>
           <w:lang w:eastAsia="es-CO"/>
         </w:rPr>
+        <w:lastRenderedPageBreak/>
         <w:drawing>
-          <wp:inline distT="0" distB="0" distL="0" distR="0" wp14:anchorId="1F671E83" wp14:editId="7F07FB5B">
+          <wp:inline distT="0" distB="0" distL="0" distR="0" wp14:anchorId="76F70D84" wp14:editId="7ECE8114">
             <wp:extent cx="5250180" cy="2392680"/>
             <wp:effectExtent l="0" t="0" r="7620" b="7620"/>
             <wp:docPr id="1049441863" name="Picture 5"/>
@@ -1199,6 +689,1266 @@
           </wp:inline>
         </w:drawing>
       </w:r>
+      <w:r>
+        <w:rPr>
+          <w:rFonts w:ascii="Arial" w:eastAsia="Times New Roman" w:hAnsi="Arial" w:cs="Arial"/>
+          <w:b/>
+          <w:bCs/>
+          <w:lang w:eastAsia="es-CO"/>
+        </w:rPr>
+        <w:br/>
+      </w:r>
+      <w:r>
+        <w:rPr>
+          <w:rFonts w:ascii="Arial" w:eastAsia="Times New Roman" w:hAnsi="Arial" w:cs="Arial"/>
+          <w:b/>
+          <w:bCs/>
+          <w:lang w:eastAsia="es-CO"/>
+        </w:rPr>
+        <w:br/>
+      </w:r>
+      <w:r>
+        <w:rPr>
+          <w:rFonts w:ascii="Arial" w:eastAsia="Times New Roman" w:hAnsi="Arial" w:cs="Arial"/>
+          <w:b/>
+          <w:bCs/>
+          <w:lang w:eastAsia="es-CO"/>
+        </w:rPr>
+        <w:br/>
+      </w:r>
+      <w:r>
+        <w:rPr>
+          <w:rFonts w:ascii="Arial" w:eastAsia="Times New Roman" w:hAnsi="Arial" w:cs="Arial"/>
+          <w:lang w:eastAsia="es-CO"/>
+        </w:rPr>
+        <w:t>Gestión</w:t>
+      </w:r>
+      <w:r>
+        <w:rPr>
+          <w:rFonts w:ascii="Arial" w:eastAsia="Times New Roman" w:hAnsi="Arial" w:cs="Arial"/>
+          <w:lang w:eastAsia="es-CO"/>
+        </w:rPr>
+        <w:t xml:space="preserve"> de Transacciones , </w:t>
+      </w:r>
+      <w:proofErr w:type="spellStart"/>
+      <w:r>
+        <w:rPr>
+          <w:rFonts w:ascii="Arial" w:eastAsia="Times New Roman" w:hAnsi="Arial" w:cs="Arial"/>
+          <w:lang w:eastAsia="es-CO"/>
+        </w:rPr>
+        <w:t>vamoo</w:t>
+      </w:r>
+      <w:proofErr w:type="spellEnd"/>
+      <w:r>
+        <w:rPr>
+          <w:rFonts w:ascii="Arial" w:eastAsia="Times New Roman" w:hAnsi="Arial" w:cs="Arial"/>
+          <w:b/>
+          <w:bCs/>
+          <w:lang w:eastAsia="es-CO"/>
+        </w:rPr>
+        <w:t>,</w:t>
+      </w:r>
+      <w:r>
+        <w:rPr>
+          <w:rFonts w:ascii="Arial" w:eastAsia="Times New Roman" w:hAnsi="Arial" w:cs="Arial"/>
+          <w:b/>
+          <w:bCs/>
+          <w:lang w:eastAsia="es-CO"/>
+        </w:rPr>
+        <w:t xml:space="preserve"> </w:t>
+      </w:r>
+      <w:r>
+        <w:rPr>
+          <w:rFonts w:ascii="Arial" w:eastAsia="Times New Roman" w:hAnsi="Arial" w:cs="Arial"/>
+          <w:lang w:eastAsia="es-CO"/>
+        </w:rPr>
+        <w:t>esta opción permite registrar compras y ventas y actualiza el stock al hacerlo para no complicar mucho, además se pueden buscar transacciones, actualizarlas por si hay errores o simplemente cambiarlas, listarla y eliminarlas, para evasión de impuestos. Además de la opción de volver al menú principal</w:t>
+      </w:r>
+    </w:p>
+    <w:p>
+      <w:pPr>
+        <w:spacing w:before="100" w:beforeAutospacing="1" w:after="100" w:afterAutospacing="1" w:line="240" w:lineRule="auto"/>
+        <w:outlineLvl w:val="2"/>
+        <w:rPr>
+          <w:rFonts w:ascii="Arial" w:eastAsia="Times New Roman" w:hAnsi="Arial" w:cs="Arial"/>
+          <w:b/>
+          <w:bCs/>
+          <w:lang w:eastAsia="es-CO"/>
+        </w:rPr>
+      </w:pPr>
+      <w:r>
+        <w:rPr>
+          <w:rFonts w:ascii="Arial" w:eastAsia="Times New Roman" w:hAnsi="Arial" w:cs="Arial"/>
+          <w:b/>
+          <w:bCs/>
+          <w:lang w:eastAsia="es-CO"/>
+        </w:rPr>
+        <w:t>MANUAL TÉCNICO</w:t>
+      </w:r>
+      <w:r>
+        <w:rPr>
+          <w:rFonts w:ascii="Arial" w:eastAsia="Times New Roman" w:hAnsi="Arial" w:cs="Arial"/>
+          <w:b/>
+          <w:bCs/>
+          <w:lang w:eastAsia="es-CO"/>
+        </w:rPr>
+        <w:t xml:space="preserve"> DEL</w:t>
+      </w:r>
+      <w:r>
+        <w:rPr>
+          <w:rFonts w:ascii="Arial" w:eastAsia="Times New Roman" w:hAnsi="Arial" w:cs="Arial"/>
+          <w:b/>
+          <w:bCs/>
+          <w:lang w:eastAsia="es-CO"/>
+        </w:rPr>
+        <w:t xml:space="preserve"> SISTEMA FARMACIA PIPO</w:t>
+      </w:r>
+    </w:p>
+    <w:p>
+      <w:pPr>
+        <w:spacing w:before="100" w:beforeAutospacing="1" w:after="100" w:afterAutospacing="1" w:line="240" w:lineRule="auto"/>
+        <w:outlineLvl w:val="3"/>
+        <w:rPr>
+          <w:rFonts w:ascii="Arial" w:eastAsia="Times New Roman" w:hAnsi="Arial" w:cs="Arial"/>
+          <w:b/>
+          <w:bCs/>
+          <w:lang w:eastAsia="es-CO"/>
+        </w:rPr>
+      </w:pPr>
+      <w:r>
+        <w:rPr>
+          <w:rFonts w:ascii="Arial" w:eastAsia="Times New Roman" w:hAnsi="Arial" w:cs="Arial"/>
+          <w:b/>
+          <w:bCs/>
+          <w:lang w:eastAsia="es-CO"/>
+        </w:rPr>
+        <w:t>1. ARQUITECTURA DEL SISTEMA Y MODULACIÓN</w:t>
+      </w:r>
+    </w:p>
+    <w:p>
+      <w:pPr>
+        <w:spacing w:before="100" w:beforeAutospacing="1" w:after="100" w:afterAutospacing="1" w:line="240" w:lineRule="auto"/>
+        <w:rPr>
+          <w:rFonts w:ascii="Arial" w:eastAsia="Times New Roman" w:hAnsi="Arial" w:cs="Arial"/>
+          <w:lang w:eastAsia="es-CO"/>
+        </w:rPr>
+      </w:pPr>
+      <w:r>
+        <w:rPr>
+          <w:rFonts w:ascii="Arial" w:eastAsia="Times New Roman" w:hAnsi="Arial" w:cs="Arial"/>
+          <w:lang w:eastAsia="es-CO"/>
+        </w:rPr>
+        <w:t xml:space="preserve">El software ha sido diseñado bajo un enfoque de </w:t>
+      </w:r>
+      <w:r>
+        <w:rPr>
+          <w:rFonts w:ascii="Arial" w:eastAsia="Times New Roman" w:hAnsi="Arial" w:cs="Arial"/>
+          <w:b/>
+          <w:bCs/>
+          <w:lang w:eastAsia="es-CO"/>
+        </w:rPr>
+        <w:t>Programación Orientada a Objetos (POO)</w:t>
+      </w:r>
+      <w:r>
+        <w:rPr>
+          <w:rFonts w:ascii="Arial" w:eastAsia="Times New Roman" w:hAnsi="Arial" w:cs="Arial"/>
+          <w:lang w:eastAsia="es-CO"/>
+        </w:rPr>
+        <w:t xml:space="preserve"> y una estructura modular. Esto significa que el código no es un bloque único, sino que está dividido en archivos especializados para facilitar su mantenimiento y escalabilidad:</w:t>
+      </w:r>
+    </w:p>
+    <w:p>
+      <w:pPr>
+        <w:numPr>
+          <w:ilvl w:val="0"/>
+          <w:numId w:val="1"/>
+        </w:numPr>
+        <w:spacing w:before="100" w:beforeAutospacing="1" w:after="100" w:afterAutospacing="1" w:line="240" w:lineRule="auto"/>
+        <w:rPr>
+          <w:rFonts w:ascii="Arial" w:eastAsia="Times New Roman" w:hAnsi="Arial" w:cs="Arial"/>
+          <w:lang w:eastAsia="es-CO"/>
+        </w:rPr>
+      </w:pPr>
+      <w:r>
+        <w:rPr>
+          <w:rFonts w:ascii="Arial" w:eastAsia="Times New Roman" w:hAnsi="Arial" w:cs="Arial"/>
+          <w:b/>
+          <w:bCs/>
+          <w:lang w:eastAsia="es-CO"/>
+        </w:rPr>
+        <w:t>Modularidad de Clases (.</w:t>
+      </w:r>
+      <w:proofErr w:type="spellStart"/>
+      <w:r>
+        <w:rPr>
+          <w:rFonts w:ascii="Arial" w:eastAsia="Times New Roman" w:hAnsi="Arial" w:cs="Arial"/>
+          <w:b/>
+          <w:bCs/>
+          <w:lang w:eastAsia="es-CO"/>
+        </w:rPr>
+        <w:t>hpp</w:t>
+      </w:r>
+      <w:proofErr w:type="spellEnd"/>
+      <w:r>
+        <w:rPr>
+          <w:rFonts w:ascii="Arial" w:eastAsia="Times New Roman" w:hAnsi="Arial" w:cs="Arial"/>
+          <w:b/>
+          <w:bCs/>
+          <w:lang w:eastAsia="es-CO"/>
+        </w:rPr>
+        <w:t xml:space="preserve"> y .</w:t>
+      </w:r>
+      <w:proofErr w:type="spellStart"/>
+      <w:r>
+        <w:rPr>
+          <w:rFonts w:ascii="Arial" w:eastAsia="Times New Roman" w:hAnsi="Arial" w:cs="Arial"/>
+          <w:b/>
+          <w:bCs/>
+          <w:lang w:eastAsia="es-CO"/>
+        </w:rPr>
+        <w:t>cpp</w:t>
+      </w:r>
+      <w:proofErr w:type="spellEnd"/>
+      <w:r>
+        <w:rPr>
+          <w:rFonts w:ascii="Arial" w:eastAsia="Times New Roman" w:hAnsi="Arial" w:cs="Arial"/>
+          <w:b/>
+          <w:bCs/>
+          <w:lang w:eastAsia="es-CO"/>
+        </w:rPr>
+        <w:t>):</w:t>
+      </w:r>
+      <w:r>
+        <w:rPr>
+          <w:rFonts w:ascii="Arial" w:eastAsia="Times New Roman" w:hAnsi="Arial" w:cs="Arial"/>
+          <w:lang w:eastAsia="es-CO"/>
+        </w:rPr>
+        <w:t xml:space="preserve"> Cada entidad del mundo real (Proveedor, Producto, Cliente, Transacción) tiene su propio archivo de cabecera (.</w:t>
+      </w:r>
+      <w:proofErr w:type="spellStart"/>
+      <w:r>
+        <w:rPr>
+          <w:rFonts w:ascii="Arial" w:eastAsia="Times New Roman" w:hAnsi="Arial" w:cs="Arial"/>
+          <w:lang w:eastAsia="es-CO"/>
+        </w:rPr>
+        <w:t>hpp</w:t>
+      </w:r>
+      <w:proofErr w:type="spellEnd"/>
+      <w:r>
+        <w:rPr>
+          <w:rFonts w:ascii="Arial" w:eastAsia="Times New Roman" w:hAnsi="Arial" w:cs="Arial"/>
+          <w:lang w:eastAsia="es-CO"/>
+        </w:rPr>
+        <w:t>) donde se define su estructura y un archivo de implementación (.</w:t>
+      </w:r>
+      <w:proofErr w:type="spellStart"/>
+      <w:r>
+        <w:rPr>
+          <w:rFonts w:ascii="Arial" w:eastAsia="Times New Roman" w:hAnsi="Arial" w:cs="Arial"/>
+          <w:lang w:eastAsia="es-CO"/>
+        </w:rPr>
+        <w:t>cpp</w:t>
+      </w:r>
+      <w:proofErr w:type="spellEnd"/>
+      <w:r>
+        <w:rPr>
+          <w:rFonts w:ascii="Arial" w:eastAsia="Times New Roman" w:hAnsi="Arial" w:cs="Arial"/>
+          <w:lang w:eastAsia="es-CO"/>
+        </w:rPr>
+        <w:t>) donde reside la lógica.</w:t>
+      </w:r>
+    </w:p>
+    <w:p>
+      <w:pPr>
+        <w:numPr>
+          <w:ilvl w:val="0"/>
+          <w:numId w:val="1"/>
+        </w:numPr>
+        <w:spacing w:before="100" w:beforeAutospacing="1" w:after="100" w:afterAutospacing="1" w:line="240" w:lineRule="auto"/>
+        <w:rPr>
+          <w:rFonts w:ascii="Arial" w:eastAsia="Times New Roman" w:hAnsi="Arial" w:cs="Arial"/>
+          <w:lang w:eastAsia="es-CO"/>
+        </w:rPr>
+      </w:pPr>
+      <w:r>
+        <w:rPr>
+          <w:rFonts w:ascii="Arial" w:eastAsia="Times New Roman" w:hAnsi="Arial" w:cs="Arial"/>
+          <w:b/>
+          <w:bCs/>
+          <w:lang w:eastAsia="es-CO"/>
+        </w:rPr>
+        <w:t>Capa de Persistencia:</w:t>
+      </w:r>
+      <w:r>
+        <w:rPr>
+          <w:rFonts w:ascii="Arial" w:eastAsia="Times New Roman" w:hAnsi="Arial" w:cs="Arial"/>
+          <w:lang w:eastAsia="es-CO"/>
+        </w:rPr>
+        <w:t xml:space="preserve"> El sistema utiliza archivos binarios (.</w:t>
+      </w:r>
+      <w:proofErr w:type="spellStart"/>
+      <w:r>
+        <w:rPr>
+          <w:rFonts w:ascii="Arial" w:eastAsia="Times New Roman" w:hAnsi="Arial" w:cs="Arial"/>
+          <w:lang w:eastAsia="es-CO"/>
+        </w:rPr>
+        <w:t>bin</w:t>
+      </w:r>
+      <w:proofErr w:type="spellEnd"/>
+      <w:r>
+        <w:rPr>
+          <w:rFonts w:ascii="Arial" w:eastAsia="Times New Roman" w:hAnsi="Arial" w:cs="Arial"/>
+          <w:lang w:eastAsia="es-CO"/>
+        </w:rPr>
+        <w:t xml:space="preserve">) para almacenar datos. El uso de </w:t>
+      </w:r>
+      <w:proofErr w:type="spellStart"/>
+      <w:r>
+        <w:rPr>
+          <w:rFonts w:ascii="Arial" w:eastAsia="Times New Roman" w:hAnsi="Arial" w:cs="Arial"/>
+          <w:lang w:eastAsia="es-CO"/>
+        </w:rPr>
+        <w:t>archivoHeader</w:t>
+      </w:r>
+      <w:proofErr w:type="spellEnd"/>
+      <w:r>
+        <w:rPr>
+          <w:rFonts w:ascii="Arial" w:eastAsia="Times New Roman" w:hAnsi="Arial" w:cs="Arial"/>
+          <w:lang w:eastAsia="es-CO"/>
+        </w:rPr>
+        <w:t xml:space="preserve"> permite gestionar metadatos (como la cantidad de registros y el ID siguiente) sin leer todo el archivo, optimizando el rendimiento.</w:t>
+      </w:r>
+    </w:p>
+    <w:p>
+      <w:pPr>
+        <w:numPr>
+          <w:ilvl w:val="0"/>
+          <w:numId w:val="1"/>
+        </w:numPr>
+        <w:spacing w:before="100" w:beforeAutospacing="1" w:after="100" w:afterAutospacing="1" w:line="240" w:lineRule="auto"/>
+        <w:rPr>
+          <w:rFonts w:ascii="Arial" w:eastAsia="Times New Roman" w:hAnsi="Arial" w:cs="Arial"/>
+          <w:lang w:eastAsia="es-CO"/>
+        </w:rPr>
+      </w:pPr>
+      <w:r>
+        <w:rPr>
+          <w:rFonts w:ascii="Arial" w:eastAsia="Times New Roman" w:hAnsi="Arial" w:cs="Arial"/>
+          <w:b/>
+          <w:bCs/>
+          <w:lang w:eastAsia="es-CO"/>
+        </w:rPr>
+        <w:t>Módulo de Soporte (VALIDACIONES):</w:t>
+      </w:r>
+      <w:r>
+        <w:rPr>
+          <w:rFonts w:ascii="Arial" w:eastAsia="Times New Roman" w:hAnsi="Arial" w:cs="Arial"/>
+          <w:lang w:eastAsia="es-CO"/>
+        </w:rPr>
+        <w:t xml:space="preserve"> Un componente transversal que centraliza la limpieza del buffer y la validación de tipos de datos, garantizando que el programa no colapse ante entradas de usuario erróneas.</w:t>
+      </w:r>
+    </w:p>
+    <w:p>
+      <w:pPr>
+        <w:spacing w:after="0" w:line="240" w:lineRule="auto"/>
+        <w:rPr>
+          <w:rFonts w:ascii="Arial" w:eastAsia="Times New Roman" w:hAnsi="Arial" w:cs="Arial"/>
+          <w:lang w:eastAsia="es-CO"/>
+        </w:rPr>
+      </w:pPr>
+      <w:r>
+        <w:rPr>
+          <w:rFonts w:ascii="Arial" w:eastAsia="Times New Roman" w:hAnsi="Arial" w:cs="Arial"/>
+          <w:lang w:eastAsia="es-CO"/>
+        </w:rPr>
+        <w:pict w14:anchorId="0C8B5D01">
+          <v:rect id="_x0000_i1025" style="width:0;height:1.5pt" o:hralign="center" o:hrstd="t" o:hr="t" fillcolor="#a0a0a0" stroked="f"/>
+        </w:pict>
+      </w:r>
+    </w:p>
+    <w:p>
+      <w:pPr>
+        <w:spacing w:before="100" w:beforeAutospacing="1" w:after="100" w:afterAutospacing="1" w:line="240" w:lineRule="auto"/>
+        <w:outlineLvl w:val="3"/>
+        <w:rPr>
+          <w:rFonts w:ascii="Arial" w:eastAsia="Times New Roman" w:hAnsi="Arial" w:cs="Arial"/>
+          <w:b/>
+          <w:bCs/>
+          <w:lang w:eastAsia="es-CO"/>
+        </w:rPr>
+      </w:pPr>
+      <w:r>
+        <w:rPr>
+          <w:rFonts w:ascii="Arial" w:eastAsia="Times New Roman" w:hAnsi="Arial" w:cs="Arial"/>
+          <w:b/>
+          <w:bCs/>
+          <w:lang w:eastAsia="es-CO"/>
+        </w:rPr>
+        <w:t>2. EXPLICACIÓN DE FUNCIONES PRINCIPALES</w:t>
+      </w:r>
+    </w:p>
+    <w:p>
+      <w:pPr>
+        <w:spacing w:before="100" w:beforeAutospacing="1" w:after="100" w:afterAutospacing="1" w:line="240" w:lineRule="auto"/>
+        <w:outlineLvl w:val="4"/>
+        <w:rPr>
+          <w:rFonts w:ascii="Arial" w:eastAsia="Times New Roman" w:hAnsi="Arial" w:cs="Arial"/>
+          <w:b/>
+          <w:bCs/>
+          <w:lang w:eastAsia="es-CO"/>
+        </w:rPr>
+      </w:pPr>
+      <w:r>
+        <w:rPr>
+          <w:rFonts w:ascii="Arial" w:eastAsia="Times New Roman" w:hAnsi="Arial" w:cs="Arial"/>
+          <w:b/>
+          <w:bCs/>
+          <w:lang w:eastAsia="es-CO"/>
+        </w:rPr>
+        <w:t>Módulo de Proveedores (PROVEEDOR.cpp)</w:t>
+      </w:r>
+    </w:p>
+    <w:p>
+      <w:pPr>
+        <w:numPr>
+          <w:ilvl w:val="0"/>
+          <w:numId w:val="2"/>
+        </w:numPr>
+        <w:spacing w:before="100" w:beforeAutospacing="1" w:after="100" w:afterAutospacing="1" w:line="240" w:lineRule="auto"/>
+        <w:rPr>
+          <w:rFonts w:ascii="Arial" w:eastAsia="Times New Roman" w:hAnsi="Arial" w:cs="Arial"/>
+          <w:lang w:eastAsia="es-CO"/>
+        </w:rPr>
+      </w:pPr>
+      <w:proofErr w:type="spellStart"/>
+      <w:r>
+        <w:rPr>
+          <w:rFonts w:ascii="Arial" w:eastAsia="Times New Roman" w:hAnsi="Arial" w:cs="Arial"/>
+          <w:b/>
+          <w:bCs/>
+          <w:lang w:eastAsia="es-CO"/>
+        </w:rPr>
+        <w:lastRenderedPageBreak/>
+        <w:t>Crearproveedor</w:t>
+      </w:r>
+      <w:proofErr w:type="spellEnd"/>
+      <w:r>
+        <w:rPr>
+          <w:rFonts w:ascii="Arial" w:eastAsia="Times New Roman" w:hAnsi="Arial" w:cs="Arial"/>
+          <w:lang w:eastAsia="es-CO"/>
+        </w:rPr>
+        <w:t>: Gestiona la entrada de datos mediante un bucle que permite registros múltiples. Valida que el ID sea único y permite la cancelación inmediata mediante la palabra clave "CANCELAR".</w:t>
+      </w:r>
+    </w:p>
+    <w:p>
+      <w:pPr>
+        <w:numPr>
+          <w:ilvl w:val="0"/>
+          <w:numId w:val="2"/>
+        </w:numPr>
+        <w:spacing w:before="100" w:beforeAutospacing="1" w:after="100" w:afterAutospacing="1" w:line="240" w:lineRule="auto"/>
+        <w:rPr>
+          <w:rFonts w:ascii="Arial" w:eastAsia="Times New Roman" w:hAnsi="Arial" w:cs="Arial"/>
+          <w:lang w:eastAsia="es-CO"/>
+        </w:rPr>
+      </w:pPr>
+      <w:proofErr w:type="spellStart"/>
+      <w:r>
+        <w:rPr>
+          <w:rFonts w:ascii="Arial" w:eastAsia="Times New Roman" w:hAnsi="Arial" w:cs="Arial"/>
+          <w:b/>
+          <w:bCs/>
+          <w:lang w:eastAsia="es-CO"/>
+        </w:rPr>
+        <w:t>buscarProveedor</w:t>
+      </w:r>
+      <w:proofErr w:type="spellEnd"/>
+      <w:r>
+        <w:rPr>
+          <w:rFonts w:ascii="Arial" w:eastAsia="Times New Roman" w:hAnsi="Arial" w:cs="Arial"/>
+          <w:lang w:eastAsia="es-CO"/>
+        </w:rPr>
+        <w:t xml:space="preserve">: Implementa una búsqueda dual. Puede localizar un registro exacto por su </w:t>
+      </w:r>
+      <w:r>
+        <w:rPr>
+          <w:rFonts w:ascii="Arial" w:eastAsia="Times New Roman" w:hAnsi="Arial" w:cs="Arial"/>
+          <w:b/>
+          <w:bCs/>
+          <w:lang w:eastAsia="es-CO"/>
+        </w:rPr>
+        <w:t>ID</w:t>
+      </w:r>
+      <w:r>
+        <w:rPr>
+          <w:rFonts w:ascii="Arial" w:eastAsia="Times New Roman" w:hAnsi="Arial" w:cs="Arial"/>
+          <w:lang w:eastAsia="es-CO"/>
+        </w:rPr>
+        <w:t xml:space="preserve"> o realizar una búsqueda por </w:t>
+      </w:r>
+      <w:r>
+        <w:rPr>
+          <w:rFonts w:ascii="Arial" w:eastAsia="Times New Roman" w:hAnsi="Arial" w:cs="Arial"/>
+          <w:b/>
+          <w:bCs/>
+          <w:lang w:eastAsia="es-CO"/>
+        </w:rPr>
+        <w:t>Nombre</w:t>
+      </w:r>
+      <w:r>
+        <w:rPr>
+          <w:rFonts w:ascii="Arial" w:eastAsia="Times New Roman" w:hAnsi="Arial" w:cs="Arial"/>
+          <w:lang w:eastAsia="es-CO"/>
+        </w:rPr>
+        <w:t>, devolviendo una lista de coincidencias parciales.</w:t>
+      </w:r>
+    </w:p>
+    <w:p>
+      <w:pPr>
+        <w:numPr>
+          <w:ilvl w:val="0"/>
+          <w:numId w:val="2"/>
+        </w:numPr>
+        <w:spacing w:before="100" w:beforeAutospacing="1" w:after="100" w:afterAutospacing="1" w:line="240" w:lineRule="auto"/>
+        <w:rPr>
+          <w:rFonts w:ascii="Arial" w:eastAsia="Times New Roman" w:hAnsi="Arial" w:cs="Arial"/>
+          <w:lang w:eastAsia="es-CO"/>
+        </w:rPr>
+      </w:pPr>
+      <w:proofErr w:type="spellStart"/>
+      <w:r>
+        <w:rPr>
+          <w:rFonts w:ascii="Arial" w:eastAsia="Times New Roman" w:hAnsi="Arial" w:cs="Arial"/>
+          <w:b/>
+          <w:bCs/>
+          <w:lang w:eastAsia="es-CO"/>
+        </w:rPr>
+        <w:t>editarProveedor</w:t>
+      </w:r>
+      <w:proofErr w:type="spellEnd"/>
+      <w:r>
+        <w:rPr>
+          <w:rFonts w:ascii="Arial" w:eastAsia="Times New Roman" w:hAnsi="Arial" w:cs="Arial"/>
+          <w:lang w:eastAsia="es-CO"/>
+        </w:rPr>
+        <w:t>: Localiza el registro en el archivo binario y permite modificar campos específicos, sobrescribiendo únicamente la sección necesaria del archivo para mantener la integridad.</w:t>
+      </w:r>
+    </w:p>
+    <w:p>
+      <w:pPr>
+        <w:spacing w:before="100" w:beforeAutospacing="1" w:after="100" w:afterAutospacing="1" w:line="240" w:lineRule="auto"/>
+        <w:outlineLvl w:val="4"/>
+        <w:rPr>
+          <w:rFonts w:ascii="Arial" w:eastAsia="Times New Roman" w:hAnsi="Arial" w:cs="Arial"/>
+          <w:b/>
+          <w:bCs/>
+          <w:lang w:eastAsia="es-CO"/>
+        </w:rPr>
+      </w:pPr>
+      <w:r>
+        <w:rPr>
+          <w:rFonts w:ascii="Arial" w:eastAsia="Times New Roman" w:hAnsi="Arial" w:cs="Arial"/>
+          <w:b/>
+          <w:bCs/>
+          <w:lang w:eastAsia="es-CO"/>
+        </w:rPr>
+        <w:t>Módulo de Transacciones (TRANSACCION.cpp)</w:t>
+      </w:r>
+    </w:p>
+    <w:p>
+      <w:pPr>
+        <w:numPr>
+          <w:ilvl w:val="0"/>
+          <w:numId w:val="3"/>
+        </w:numPr>
+        <w:spacing w:before="100" w:beforeAutospacing="1" w:after="100" w:afterAutospacing="1" w:line="240" w:lineRule="auto"/>
+        <w:rPr>
+          <w:rFonts w:ascii="Arial" w:eastAsia="Times New Roman" w:hAnsi="Arial" w:cs="Arial"/>
+          <w:lang w:eastAsia="es-CO"/>
+        </w:rPr>
+      </w:pPr>
+      <w:r>
+        <w:rPr>
+          <w:rFonts w:ascii="Arial" w:eastAsia="Times New Roman" w:hAnsi="Arial" w:cs="Arial"/>
+          <w:b/>
+          <w:bCs/>
+          <w:lang w:eastAsia="es-CO"/>
+        </w:rPr>
+        <w:t>venta</w:t>
+      </w:r>
+      <w:r>
+        <w:rPr>
+          <w:rFonts w:ascii="Arial" w:eastAsia="Times New Roman" w:hAnsi="Arial" w:cs="Arial"/>
+          <w:lang w:eastAsia="es-CO"/>
+        </w:rPr>
+        <w:t>: Es la función más compleja. Realiza tres tareas críticas:</w:t>
+      </w:r>
+    </w:p>
+    <w:p>
+      <w:pPr>
+        <w:numPr>
+          <w:ilvl w:val="1"/>
+          <w:numId w:val="3"/>
+        </w:numPr>
+        <w:spacing w:before="100" w:beforeAutospacing="1" w:after="100" w:afterAutospacing="1" w:line="240" w:lineRule="auto"/>
+        <w:rPr>
+          <w:rFonts w:ascii="Arial" w:eastAsia="Times New Roman" w:hAnsi="Arial" w:cs="Arial"/>
+          <w:lang w:eastAsia="es-CO"/>
+        </w:rPr>
+      </w:pPr>
+      <w:r>
+        <w:rPr>
+          <w:rFonts w:ascii="Arial" w:eastAsia="Times New Roman" w:hAnsi="Arial" w:cs="Arial"/>
+          <w:lang w:eastAsia="es-CO"/>
+        </w:rPr>
+        <w:t>Valida la existencia del cliente.</w:t>
+      </w:r>
+    </w:p>
+    <w:p>
+      <w:pPr>
+        <w:numPr>
+          <w:ilvl w:val="1"/>
+          <w:numId w:val="3"/>
+        </w:numPr>
+        <w:spacing w:before="100" w:beforeAutospacing="1" w:after="100" w:afterAutospacing="1" w:line="240" w:lineRule="auto"/>
+        <w:rPr>
+          <w:rFonts w:ascii="Arial" w:eastAsia="Times New Roman" w:hAnsi="Arial" w:cs="Arial"/>
+          <w:lang w:eastAsia="es-CO"/>
+        </w:rPr>
+      </w:pPr>
+      <w:r>
+        <w:rPr>
+          <w:rFonts w:ascii="Arial" w:eastAsia="Times New Roman" w:hAnsi="Arial" w:cs="Arial"/>
+          <w:lang w:eastAsia="es-CO"/>
+        </w:rPr>
+        <w:t xml:space="preserve">Verifica mediante la función </w:t>
+      </w:r>
+      <w:proofErr w:type="spellStart"/>
+      <w:r>
+        <w:rPr>
+          <w:rFonts w:ascii="Arial" w:eastAsia="Times New Roman" w:hAnsi="Arial" w:cs="Arial"/>
+          <w:lang w:eastAsia="es-CO"/>
+        </w:rPr>
+        <w:t>validarStock</w:t>
+      </w:r>
+      <w:proofErr w:type="spellEnd"/>
+      <w:r>
+        <w:rPr>
+          <w:rFonts w:ascii="Arial" w:eastAsia="Times New Roman" w:hAnsi="Arial" w:cs="Arial"/>
+          <w:lang w:eastAsia="es-CO"/>
+        </w:rPr>
+        <w:t xml:space="preserve"> si hay existencias suficientes.</w:t>
+      </w:r>
+    </w:p>
+    <w:p>
+      <w:pPr>
+        <w:numPr>
+          <w:ilvl w:val="1"/>
+          <w:numId w:val="3"/>
+        </w:numPr>
+        <w:spacing w:before="100" w:beforeAutospacing="1" w:after="100" w:afterAutospacing="1" w:line="240" w:lineRule="auto"/>
+        <w:rPr>
+          <w:rFonts w:ascii="Arial" w:eastAsia="Times New Roman" w:hAnsi="Arial" w:cs="Arial"/>
+          <w:lang w:eastAsia="es-CO"/>
+        </w:rPr>
+      </w:pPr>
+      <w:r>
+        <w:rPr>
+          <w:rFonts w:ascii="Arial" w:eastAsia="Times New Roman" w:hAnsi="Arial" w:cs="Arial"/>
+          <w:lang w:eastAsia="es-CO"/>
+        </w:rPr>
+        <w:t>Actualiza el archivo de productos para restar el stock vendido y genera un registro en el histórico de transacciones.</w:t>
+      </w:r>
+    </w:p>
+    <w:p>
+      <w:pPr>
+        <w:numPr>
+          <w:ilvl w:val="0"/>
+          <w:numId w:val="3"/>
+        </w:numPr>
+        <w:spacing w:before="100" w:beforeAutospacing="1" w:after="100" w:afterAutospacing="1" w:line="240" w:lineRule="auto"/>
+        <w:rPr>
+          <w:rFonts w:ascii="Arial" w:eastAsia="Times New Roman" w:hAnsi="Arial" w:cs="Arial"/>
+          <w:lang w:eastAsia="es-CO"/>
+        </w:rPr>
+      </w:pPr>
+      <w:r>
+        <w:rPr>
+          <w:rFonts w:ascii="Arial" w:eastAsia="Times New Roman" w:hAnsi="Arial" w:cs="Arial"/>
+          <w:b/>
+          <w:bCs/>
+          <w:lang w:eastAsia="es-CO"/>
+        </w:rPr>
+        <w:t>compra</w:t>
+      </w:r>
+      <w:r>
+        <w:rPr>
+          <w:rFonts w:ascii="Arial" w:eastAsia="Times New Roman" w:hAnsi="Arial" w:cs="Arial"/>
+          <w:lang w:eastAsia="es-CO"/>
+        </w:rPr>
+        <w:t>: Funciona de forma inversa a la venta, incrementando el stock de productos tras validar la existencia de un proveedor activo.</w:t>
+      </w:r>
+    </w:p>
+    <w:p>
+      <w:pPr>
+        <w:numPr>
+          <w:ilvl w:val="0"/>
+          <w:numId w:val="3"/>
+        </w:numPr>
+        <w:spacing w:before="100" w:beforeAutospacing="1" w:after="100" w:afterAutospacing="1" w:line="240" w:lineRule="auto"/>
+        <w:rPr>
+          <w:rFonts w:ascii="Arial" w:eastAsia="Times New Roman" w:hAnsi="Arial" w:cs="Arial"/>
+          <w:lang w:eastAsia="es-CO"/>
+        </w:rPr>
+      </w:pPr>
+      <w:proofErr w:type="spellStart"/>
+      <w:r>
+        <w:rPr>
+          <w:rFonts w:ascii="Arial" w:eastAsia="Times New Roman" w:hAnsi="Arial" w:cs="Arial"/>
+          <w:b/>
+          <w:bCs/>
+          <w:lang w:eastAsia="es-CO"/>
+        </w:rPr>
+        <w:t>listartransaccion</w:t>
+      </w:r>
+      <w:proofErr w:type="spellEnd"/>
+      <w:r>
+        <w:rPr>
+          <w:rFonts w:ascii="Arial" w:eastAsia="Times New Roman" w:hAnsi="Arial" w:cs="Arial"/>
+          <w:lang w:eastAsia="es-CO"/>
+        </w:rPr>
+        <w:t xml:space="preserve">: Recorre el archivo de transacciones y, de forma anidada, busca los detalles en el archivo de </w:t>
+      </w:r>
+      <w:proofErr w:type="spellStart"/>
+      <w:r>
+        <w:rPr>
+          <w:rFonts w:ascii="Arial" w:eastAsia="Times New Roman" w:hAnsi="Arial" w:cs="Arial"/>
+          <w:lang w:eastAsia="es-CO"/>
+        </w:rPr>
+        <w:t>Productoventa</w:t>
+      </w:r>
+      <w:proofErr w:type="spellEnd"/>
+      <w:r>
+        <w:rPr>
+          <w:rFonts w:ascii="Arial" w:eastAsia="Times New Roman" w:hAnsi="Arial" w:cs="Arial"/>
+          <w:lang w:eastAsia="es-CO"/>
+        </w:rPr>
+        <w:t xml:space="preserve"> para mostrar un desglose completo de cada operación.</w:t>
+      </w:r>
+    </w:p>
+    <w:p>
+      <w:pPr>
+        <w:spacing w:before="100" w:beforeAutospacing="1" w:after="100" w:afterAutospacing="1" w:line="240" w:lineRule="auto"/>
+        <w:outlineLvl w:val="4"/>
+        <w:rPr>
+          <w:rFonts w:ascii="Arial" w:eastAsia="Times New Roman" w:hAnsi="Arial" w:cs="Arial"/>
+          <w:b/>
+          <w:bCs/>
+          <w:lang w:eastAsia="es-CO"/>
+        </w:rPr>
+      </w:pPr>
+      <w:r>
+        <w:rPr>
+          <w:rFonts w:ascii="Arial" w:eastAsia="Times New Roman" w:hAnsi="Arial" w:cs="Arial"/>
+          <w:b/>
+          <w:bCs/>
+          <w:lang w:eastAsia="es-CO"/>
+        </w:rPr>
+        <w:t>Módulo de Validación (VALIDACIONES.cpp)</w:t>
+      </w:r>
+    </w:p>
+    <w:p>
+      <w:pPr>
+        <w:numPr>
+          <w:ilvl w:val="0"/>
+          <w:numId w:val="4"/>
+        </w:numPr>
+        <w:spacing w:before="100" w:beforeAutospacing="1" w:after="100" w:afterAutospacing="1" w:line="240" w:lineRule="auto"/>
+        <w:rPr>
+          <w:rFonts w:ascii="Arial" w:eastAsia="Times New Roman" w:hAnsi="Arial" w:cs="Arial"/>
+          <w:lang w:eastAsia="es-CO"/>
+        </w:rPr>
+      </w:pPr>
+      <w:proofErr w:type="spellStart"/>
+      <w:r>
+        <w:rPr>
+          <w:rFonts w:ascii="Arial" w:eastAsia="Times New Roman" w:hAnsi="Arial" w:cs="Arial"/>
+          <w:b/>
+          <w:bCs/>
+          <w:lang w:eastAsia="es-CO"/>
+        </w:rPr>
+        <w:t>esNumero</w:t>
+      </w:r>
+      <w:proofErr w:type="spellEnd"/>
+      <w:r>
+        <w:rPr>
+          <w:rFonts w:ascii="Arial" w:eastAsia="Times New Roman" w:hAnsi="Arial" w:cs="Arial"/>
+          <w:b/>
+          <w:bCs/>
+          <w:lang w:eastAsia="es-CO"/>
+        </w:rPr>
+        <w:t xml:space="preserve"> y </w:t>
+      </w:r>
+      <w:proofErr w:type="spellStart"/>
+      <w:r>
+        <w:rPr>
+          <w:rFonts w:ascii="Arial" w:eastAsia="Times New Roman" w:hAnsi="Arial" w:cs="Arial"/>
+          <w:b/>
+          <w:bCs/>
+          <w:lang w:eastAsia="es-CO"/>
+        </w:rPr>
+        <w:t>convertirAEntero</w:t>
+      </w:r>
+      <w:proofErr w:type="spellEnd"/>
+      <w:r>
+        <w:rPr>
+          <w:rFonts w:ascii="Arial" w:eastAsia="Times New Roman" w:hAnsi="Arial" w:cs="Arial"/>
+          <w:lang w:eastAsia="es-CO"/>
+        </w:rPr>
+        <w:t>: Filtros de seguridad que aseguran que las entradas destinadas a cálculos numéricos no contengan caracteres alfabéticos.</w:t>
+      </w:r>
+    </w:p>
+    <w:p>
+      <w:pPr>
+        <w:numPr>
+          <w:ilvl w:val="0"/>
+          <w:numId w:val="4"/>
+        </w:numPr>
+        <w:spacing w:before="100" w:beforeAutospacing="1" w:after="100" w:afterAutospacing="1" w:line="240" w:lineRule="auto"/>
+        <w:rPr>
+          <w:rFonts w:ascii="Arial" w:eastAsia="Times New Roman" w:hAnsi="Arial" w:cs="Arial"/>
+          <w:lang w:eastAsia="es-CO"/>
+        </w:rPr>
+      </w:pPr>
+      <w:proofErr w:type="spellStart"/>
+      <w:r>
+        <w:rPr>
+          <w:rFonts w:ascii="Arial" w:eastAsia="Times New Roman" w:hAnsi="Arial" w:cs="Arial"/>
+          <w:b/>
+          <w:bCs/>
+          <w:lang w:eastAsia="es-CO"/>
+        </w:rPr>
+        <w:t>opcionSN</w:t>
+      </w:r>
+      <w:proofErr w:type="spellEnd"/>
+      <w:r>
+        <w:rPr>
+          <w:rFonts w:ascii="Arial" w:eastAsia="Times New Roman" w:hAnsi="Arial" w:cs="Arial"/>
+          <w:lang w:eastAsia="es-CO"/>
+        </w:rPr>
+        <w:t>: Estandariza las respuestas de confirmación del usuario, aceptando variantes como "S", "s", "Si" o "SI".</w:t>
+      </w:r>
+    </w:p>
+    <w:p>
+      <w:pPr>
+        <w:spacing w:after="0" w:line="240" w:lineRule="auto"/>
+        <w:rPr>
+          <w:rFonts w:ascii="Arial" w:eastAsia="Times New Roman" w:hAnsi="Arial" w:cs="Arial"/>
+          <w:lang w:eastAsia="es-CO"/>
+        </w:rPr>
+      </w:pPr>
+      <w:r>
+        <w:rPr>
+          <w:rFonts w:ascii="Arial" w:eastAsia="Times New Roman" w:hAnsi="Arial" w:cs="Arial"/>
+          <w:lang w:eastAsia="es-CO"/>
+        </w:rPr>
+        <w:pict w14:anchorId="597B96B3">
+          <v:rect id="_x0000_i1026" style="width:0;height:1.5pt" o:hralign="center" o:hrstd="t" o:hr="t" fillcolor="#a0a0a0" stroked="f"/>
+        </w:pict>
+      </w:r>
+    </w:p>
+    <w:p>
+      <w:pPr>
+        <w:spacing w:before="100" w:beforeAutospacing="1" w:after="100" w:afterAutospacing="1" w:line="240" w:lineRule="auto"/>
+        <w:outlineLvl w:val="3"/>
+        <w:rPr>
+          <w:rFonts w:ascii="Arial" w:eastAsia="Times New Roman" w:hAnsi="Arial" w:cs="Arial"/>
+          <w:b/>
+          <w:bCs/>
+          <w:lang w:eastAsia="es-CO"/>
+        </w:rPr>
+      </w:pPr>
+      <w:r>
+        <w:rPr>
+          <w:rFonts w:ascii="Arial" w:eastAsia="Times New Roman" w:hAnsi="Arial" w:cs="Arial"/>
+          <w:b/>
+          <w:bCs/>
+          <w:lang w:eastAsia="es-CO"/>
+        </w:rPr>
+        <w:t>3. ORGANIZACIÓN DEL FLUJO DE DATOS</w:t>
+      </w:r>
+    </w:p>
+    <w:p>
+      <w:pPr>
+        <w:spacing w:before="100" w:beforeAutospacing="1" w:after="100" w:afterAutospacing="1" w:line="240" w:lineRule="auto"/>
+        <w:rPr>
+          <w:rFonts w:ascii="Arial" w:eastAsia="Times New Roman" w:hAnsi="Arial" w:cs="Arial"/>
+          <w:lang w:eastAsia="es-CO"/>
+        </w:rPr>
+      </w:pPr>
+      <w:r>
+        <w:rPr>
+          <w:rFonts w:ascii="Arial" w:eastAsia="Times New Roman" w:hAnsi="Arial" w:cs="Arial"/>
+          <w:lang w:eastAsia="es-CO"/>
+        </w:rPr>
+        <w:t xml:space="preserve">El programa sigue un flujo jerárquico controlado por el archivo </w:t>
+      </w:r>
+      <w:r>
+        <w:rPr>
+          <w:rFonts w:ascii="Arial" w:eastAsia="Times New Roman" w:hAnsi="Arial" w:cs="Arial"/>
+          <w:b/>
+          <w:bCs/>
+          <w:lang w:eastAsia="es-CO"/>
+        </w:rPr>
+        <w:t>proyectov5.cpp</w:t>
+      </w:r>
+      <w:r>
+        <w:rPr>
+          <w:rFonts w:ascii="Arial" w:eastAsia="Times New Roman" w:hAnsi="Arial" w:cs="Arial"/>
+          <w:lang w:eastAsia="es-CO"/>
+        </w:rPr>
+        <w:t>:</w:t>
+      </w:r>
+    </w:p>
+    <w:p>
+      <w:pPr>
+        <w:numPr>
+          <w:ilvl w:val="0"/>
+          <w:numId w:val="5"/>
+        </w:numPr>
+        <w:spacing w:before="100" w:beforeAutospacing="1" w:after="100" w:afterAutospacing="1" w:line="240" w:lineRule="auto"/>
+        <w:rPr>
+          <w:rFonts w:ascii="Arial" w:eastAsia="Times New Roman" w:hAnsi="Arial" w:cs="Arial"/>
+          <w:lang w:eastAsia="es-CO"/>
+        </w:rPr>
+      </w:pPr>
+      <w:r>
+        <w:rPr>
+          <w:rFonts w:ascii="Arial" w:eastAsia="Times New Roman" w:hAnsi="Arial" w:cs="Arial"/>
+          <w:b/>
+          <w:bCs/>
+          <w:lang w:eastAsia="es-CO"/>
+        </w:rPr>
+        <w:t>Arranque</w:t>
+      </w:r>
+      <w:r>
+        <w:rPr>
+          <w:rFonts w:ascii="Arial" w:eastAsia="Times New Roman" w:hAnsi="Arial" w:cs="Arial"/>
+          <w:lang w:eastAsia="es-CO"/>
+        </w:rPr>
+        <w:t>: Se abren los flujos de archivos (</w:t>
+      </w:r>
+      <w:proofErr w:type="spellStart"/>
+      <w:r>
+        <w:rPr>
+          <w:rFonts w:ascii="Arial" w:eastAsia="Times New Roman" w:hAnsi="Arial" w:cs="Arial"/>
+          <w:lang w:eastAsia="es-CO"/>
+        </w:rPr>
+        <w:t>fstream</w:t>
+      </w:r>
+      <w:proofErr w:type="spellEnd"/>
+      <w:r>
+        <w:rPr>
+          <w:rFonts w:ascii="Arial" w:eastAsia="Times New Roman" w:hAnsi="Arial" w:cs="Arial"/>
+          <w:lang w:eastAsia="es-CO"/>
+        </w:rPr>
+        <w:t>) en modo binario y se cargan los encabezados a memoria.</w:t>
+      </w:r>
+    </w:p>
+    <w:p>
+      <w:pPr>
+        <w:numPr>
+          <w:ilvl w:val="0"/>
+          <w:numId w:val="5"/>
+        </w:numPr>
+        <w:spacing w:before="100" w:beforeAutospacing="1" w:after="100" w:afterAutospacing="1" w:line="240" w:lineRule="auto"/>
+        <w:rPr>
+          <w:rFonts w:ascii="Arial" w:eastAsia="Times New Roman" w:hAnsi="Arial" w:cs="Arial"/>
+          <w:lang w:eastAsia="es-CO"/>
+        </w:rPr>
+      </w:pPr>
+      <w:r>
+        <w:rPr>
+          <w:rFonts w:ascii="Arial" w:eastAsia="Times New Roman" w:hAnsi="Arial" w:cs="Arial"/>
+          <w:b/>
+          <w:bCs/>
+          <w:lang w:eastAsia="es-CO"/>
+        </w:rPr>
+        <w:t>Operación</w:t>
+      </w:r>
+      <w:r>
+        <w:rPr>
+          <w:rFonts w:ascii="Arial" w:eastAsia="Times New Roman" w:hAnsi="Arial" w:cs="Arial"/>
+          <w:lang w:eastAsia="es-CO"/>
+        </w:rPr>
+        <w:t xml:space="preserve">: El </w:t>
+      </w:r>
+      <w:proofErr w:type="spellStart"/>
+      <w:r>
+        <w:rPr>
+          <w:rFonts w:ascii="Arial" w:eastAsia="Times New Roman" w:hAnsi="Arial" w:cs="Arial"/>
+          <w:lang w:eastAsia="es-CO"/>
+        </w:rPr>
+        <w:t>main</w:t>
+      </w:r>
+      <w:proofErr w:type="spellEnd"/>
+      <w:r>
+        <w:rPr>
+          <w:rFonts w:ascii="Arial" w:eastAsia="Times New Roman" w:hAnsi="Arial" w:cs="Arial"/>
+          <w:lang w:eastAsia="es-CO"/>
+        </w:rPr>
+        <w:t xml:space="preserve"> actúa como despachador, enviando al usuario a los menús específicos de cada clase.</w:t>
+      </w:r>
+    </w:p>
+    <w:p>
+      <w:pPr>
+        <w:numPr>
+          <w:ilvl w:val="0"/>
+          <w:numId w:val="5"/>
+        </w:numPr>
+        <w:spacing w:before="100" w:beforeAutospacing="1" w:after="100" w:afterAutospacing="1" w:line="240" w:lineRule="auto"/>
+        <w:rPr>
+          <w:rFonts w:ascii="Arial" w:eastAsia="Times New Roman" w:hAnsi="Arial" w:cs="Arial"/>
+          <w:lang w:eastAsia="es-CO"/>
+        </w:rPr>
+      </w:pPr>
+      <w:r>
+        <w:rPr>
+          <w:rFonts w:ascii="Arial" w:eastAsia="Times New Roman" w:hAnsi="Arial" w:cs="Arial"/>
+          <w:b/>
+          <w:bCs/>
+          <w:lang w:eastAsia="es-CO"/>
+        </w:rPr>
+        <w:t>Cierre Seguro</w:t>
+      </w:r>
+      <w:r>
+        <w:rPr>
+          <w:rFonts w:ascii="Arial" w:eastAsia="Times New Roman" w:hAnsi="Arial" w:cs="Arial"/>
+          <w:lang w:eastAsia="es-CO"/>
+        </w:rPr>
+        <w:t xml:space="preserve">: Al seleccionar "Salir", el sistema ejecuta la función </w:t>
+      </w:r>
+      <w:proofErr w:type="spellStart"/>
+      <w:r>
+        <w:rPr>
+          <w:rFonts w:ascii="Arial" w:eastAsia="Times New Roman" w:hAnsi="Arial" w:cs="Arial"/>
+          <w:lang w:eastAsia="es-CO"/>
+        </w:rPr>
+        <w:t>actualizarheader</w:t>
+      </w:r>
+      <w:proofErr w:type="spellEnd"/>
+      <w:r>
+        <w:rPr>
+          <w:rFonts w:ascii="Arial" w:eastAsia="Times New Roman" w:hAnsi="Arial" w:cs="Arial"/>
+          <w:lang w:eastAsia="es-CO"/>
+        </w:rPr>
+        <w:t>. Esto asegura que el conteo de registros se guarde correctamente en el disco antes de cerrar los archivos, evitando la corrupción de datos.</w:t>
+      </w:r>
+    </w:p>
+    <w:p>
+      <w:pPr>
+        <w:spacing w:after="0" w:line="240" w:lineRule="auto"/>
+        <w:rPr>
+          <w:rFonts w:ascii="Arial" w:eastAsia="Times New Roman" w:hAnsi="Arial" w:cs="Arial"/>
+          <w:sz w:val="28"/>
+          <w:szCs w:val="28"/>
+          <w:lang w:eastAsia="es-CO"/>
+        </w:rPr>
+      </w:pPr>
+      <w:r>
+        <w:rPr>
+          <w:rFonts w:ascii="Arial" w:eastAsia="Times New Roman" w:hAnsi="Arial" w:cs="Arial"/>
+          <w:sz w:val="28"/>
+          <w:szCs w:val="28"/>
+          <w:lang w:eastAsia="es-CO"/>
+        </w:rPr>
+        <w:pict w14:anchorId="755138BA">
+          <v:rect id="_x0000_i1027" style="width:0;height:1.5pt" o:hralign="center" o:hrstd="t" o:hr="t" fillcolor="#a0a0a0" stroked="f"/>
+        </w:pict>
+      </w:r>
+    </w:p>
+    <w:p>
+      <w:pPr>
+        <w:spacing w:before="100" w:beforeAutospacing="1" w:after="100" w:afterAutospacing="1" w:line="240" w:lineRule="auto"/>
+        <w:outlineLvl w:val="3"/>
+        <w:rPr>
+          <w:rFonts w:ascii="Arial" w:eastAsia="Times New Roman" w:hAnsi="Arial" w:cs="Arial"/>
+          <w:b/>
+          <w:bCs/>
+          <w:lang w:eastAsia="es-CO"/>
+        </w:rPr>
+      </w:pPr>
+      <w:r>
+        <w:rPr>
+          <w:rFonts w:ascii="Arial" w:eastAsia="Times New Roman" w:hAnsi="Arial" w:cs="Arial"/>
+          <w:b/>
+          <w:bCs/>
+          <w:lang w:eastAsia="es-CO"/>
+        </w:rPr>
+        <w:t>4. INSTRUCCIONES DE OPERACIÓN</w:t>
+      </w:r>
+    </w:p>
+    <w:p>
+      <w:pPr>
+        <w:numPr>
+          <w:ilvl w:val="0"/>
+          <w:numId w:val="6"/>
+        </w:numPr>
+        <w:spacing w:before="100" w:beforeAutospacing="1" w:after="100" w:afterAutospacing="1" w:line="240" w:lineRule="auto"/>
+        <w:rPr>
+          <w:rFonts w:ascii="Arial" w:eastAsia="Times New Roman" w:hAnsi="Arial" w:cs="Arial"/>
+          <w:lang w:eastAsia="es-CO"/>
+        </w:rPr>
+      </w:pPr>
+      <w:r>
+        <w:rPr>
+          <w:rFonts w:ascii="Arial" w:eastAsia="Times New Roman" w:hAnsi="Arial" w:cs="Arial"/>
+          <w:b/>
+          <w:bCs/>
+          <w:lang w:eastAsia="es-CO"/>
+        </w:rPr>
+        <w:lastRenderedPageBreak/>
+        <w:t>Registro de Datos</w:t>
+      </w:r>
+      <w:r>
+        <w:rPr>
+          <w:rFonts w:ascii="Arial" w:eastAsia="Times New Roman" w:hAnsi="Arial" w:cs="Arial"/>
+          <w:lang w:eastAsia="es-CO"/>
+        </w:rPr>
+        <w:t xml:space="preserve">: Al ingresar nombres o descripciones, el sistema admite espacios. Si desea interrumpir cualquier proceso, ingrese </w:t>
+      </w:r>
+      <w:r>
+        <w:rPr>
+          <w:rFonts w:ascii="Arial" w:eastAsia="Times New Roman" w:hAnsi="Arial" w:cs="Arial"/>
+          <w:b/>
+          <w:bCs/>
+          <w:lang w:eastAsia="es-CO"/>
+        </w:rPr>
+        <w:t>"0"</w:t>
+      </w:r>
+      <w:r>
+        <w:rPr>
+          <w:rFonts w:ascii="Arial" w:eastAsia="Times New Roman" w:hAnsi="Arial" w:cs="Arial"/>
+          <w:lang w:eastAsia="es-CO"/>
+        </w:rPr>
+        <w:t xml:space="preserve"> o </w:t>
+      </w:r>
+      <w:r>
+        <w:rPr>
+          <w:rFonts w:ascii="Arial" w:eastAsia="Times New Roman" w:hAnsi="Arial" w:cs="Arial"/>
+          <w:b/>
+          <w:bCs/>
+          <w:lang w:eastAsia="es-CO"/>
+        </w:rPr>
+        <w:t>"CANCELAR"</w:t>
+      </w:r>
+      <w:r>
+        <w:rPr>
+          <w:rFonts w:ascii="Arial" w:eastAsia="Times New Roman" w:hAnsi="Arial" w:cs="Arial"/>
+          <w:lang w:eastAsia="es-CO"/>
+        </w:rPr>
+        <w:t xml:space="preserve"> cuando se le solicite un dato clave.</w:t>
+      </w:r>
+    </w:p>
+    <w:p>
+      <w:pPr>
+        <w:numPr>
+          <w:ilvl w:val="0"/>
+          <w:numId w:val="6"/>
+        </w:numPr>
+        <w:spacing w:before="100" w:beforeAutospacing="1" w:after="100" w:afterAutospacing="1" w:line="240" w:lineRule="auto"/>
+        <w:rPr>
+          <w:rFonts w:ascii="Arial" w:eastAsia="Times New Roman" w:hAnsi="Arial" w:cs="Arial"/>
+          <w:lang w:eastAsia="es-CO"/>
+        </w:rPr>
+      </w:pPr>
+      <w:r>
+        <w:rPr>
+          <w:rFonts w:ascii="Arial" w:eastAsia="Times New Roman" w:hAnsi="Arial" w:cs="Arial"/>
+          <w:b/>
+          <w:bCs/>
+          <w:lang w:eastAsia="es-CO"/>
+        </w:rPr>
+        <w:t>Gestión de Stock</w:t>
+      </w:r>
+      <w:r>
+        <w:rPr>
+          <w:rFonts w:ascii="Arial" w:eastAsia="Times New Roman" w:hAnsi="Arial" w:cs="Arial"/>
+          <w:lang w:eastAsia="es-CO"/>
+        </w:rPr>
+        <w:t xml:space="preserve">: No es necesario editar el producto manualmente tras una venta; el sistema de </w:t>
+      </w:r>
+      <w:r>
+        <w:rPr>
+          <w:rFonts w:ascii="Arial" w:eastAsia="Times New Roman" w:hAnsi="Arial" w:cs="Arial"/>
+          <w:b/>
+          <w:bCs/>
+          <w:lang w:eastAsia="es-CO"/>
+        </w:rPr>
+        <w:t>Transacciones</w:t>
+      </w:r>
+      <w:r>
+        <w:rPr>
+          <w:rFonts w:ascii="Arial" w:eastAsia="Times New Roman" w:hAnsi="Arial" w:cs="Arial"/>
+          <w:lang w:eastAsia="es-CO"/>
+        </w:rPr>
+        <w:t xml:space="preserve"> actualiza automáticamente las existencias para asegurar que la información sea siempre fidedigna.</w:t>
+      </w:r>
+    </w:p>
+    <w:p>
+      <w:pPr>
+        <w:numPr>
+          <w:ilvl w:val="0"/>
+          <w:numId w:val="6"/>
+        </w:numPr>
+        <w:spacing w:before="100" w:beforeAutospacing="1" w:after="100" w:afterAutospacing="1" w:line="240" w:lineRule="auto"/>
+        <w:rPr>
+          <w:rFonts w:ascii="Arial" w:eastAsia="Times New Roman" w:hAnsi="Arial" w:cs="Arial"/>
+          <w:lang w:eastAsia="es-CO"/>
+        </w:rPr>
+      </w:pPr>
+      <w:r>
+        <w:rPr>
+          <w:rFonts w:ascii="Arial" w:eastAsia="Times New Roman" w:hAnsi="Arial" w:cs="Arial"/>
+          <w:b/>
+          <w:bCs/>
+          <w:lang w:eastAsia="es-CO"/>
+        </w:rPr>
+        <w:t>Búsquedas</w:t>
+      </w:r>
+      <w:r>
+        <w:rPr>
+          <w:rFonts w:ascii="Arial" w:eastAsia="Times New Roman" w:hAnsi="Arial" w:cs="Arial"/>
+          <w:lang w:eastAsia="es-CO"/>
+        </w:rPr>
+        <w:t>: Si no recuerda el ID exacto, utilice la búsqueda por nombre. El sistema le presentará una lista numerada de opciones encontradas para que usted seleccione la correcta.</w:t>
+      </w:r>
+      <w:r>
+        <w:rPr>
+          <w:rFonts w:ascii="Arial" w:eastAsia="Times New Roman" w:hAnsi="Arial" w:cs="Arial"/>
+          <w:lang w:eastAsia="es-CO"/>
+        </w:rPr>
+        <w:br/>
+      </w:r>
+    </w:p>
+    <w:p>
+      <w:pPr>
+        <w:spacing w:before="100" w:beforeAutospacing="1" w:after="100" w:afterAutospacing="1" w:line="240" w:lineRule="auto"/>
+        <w:ind w:left="360"/>
+        <w:rPr>
+          <w:rFonts w:ascii="Arial" w:eastAsia="Times New Roman" w:hAnsi="Arial" w:cs="Arial"/>
+          <w:lang w:eastAsia="es-CO"/>
+        </w:rPr>
+      </w:pPr>
+      <w:r>
+        <w:rPr>
+          <w:rFonts w:ascii="Arial" w:eastAsia="Times New Roman" w:hAnsi="Arial" w:cs="Arial"/>
+          <w:b/>
+          <w:bCs/>
+          <w:lang w:eastAsia="es-CO"/>
+        </w:rPr>
+        <w:br/>
+      </w:r>
     </w:p>
     <w:p>
       <w:pPr>
@@ -1218,7 +1968,7 @@
 </file>
 
 <file path=word/numbering.xml><?xml version="1.0" encoding="utf-8"?>
-<w:numbering xmlns:wpc="http://schemas.microsoft.com/office/word/2010/wordprocessingCanvas" xmlns:cx="http://schemas.microsoft.com/office/drawing/2014/chartex" xmlns:cx1="http://schemas.microsoft.com/office/drawing/2015/9/8/chartex" xmlns:cx2="http://schemas.microsoft.com/office/drawing/2015/10/21/chartex" xmlns:cx3="http://schemas.microsoft.com/office/drawing/2016/5/9/chartex" xmlns:cx4="http://schemas.microsoft.com/office/drawing/2016/5/10/chartex" xmlns:cx5="http://schemas.microsoft.com/office/drawing/2016/5/11/chartex" xmlns:cx6="http://schemas.microsoft.com/office/drawing/2016/5/12/chartex" xmlns:cx7="http://schemas.microsoft.com/office/drawing/2016/5/13/chartex" xmlns:cx8="http://schemas.microsoft.com/office/drawing/2016/5/14/chartex" xmlns:mc="http://schemas.openxmlformats.org/markup-compatibility/2006" xmlns:aink="http://schemas.microsoft.com/office/drawing/2016/ink" xmlns:am3d="http://schemas.microsoft.com/office/drawing/2017/model3d" xmlns:o="urn:schemas-microsoft-com:office:office" xmlns:oel="http://schemas.microsoft.com/office/2019/extlst" xmlns:r="http://schemas.openxmlformats.org/officeDocument/2006/relationships" xmlns:m="http://schemas.openxmlformats.org/officeDocument/2006/math" xmlns:v="urn:schemas-microsoft-com:vml" xmlns:wp14="http://schemas.microsoft.com/office/word/2010/wordprocessingDrawing" xmlns:wp="http://schemas.openxmlformats.org/drawingml/2006/wordprocessingDrawing" xmlns:w10="urn:schemas-microsoft-com:office:word" xmlns:w="http://schemas.openxmlformats.org/wordprocessingml/2006/main" xmlns:w14="http://schemas.microsoft.com/office/word/2010/wordml" xmlns:w15="http://schemas.microsoft.com/office/word/2012/wordml" xmlns:w16cex="http://schemas.microsoft.com/office/word/2018/wordml/cex" xmlns:w16cid="http://schemas.microsoft.com/office/word/2016/wordml/cid" xmlns:w16="http://schemas.microsoft.com/office/word/2018/wordml" xmlns:w16du="http://schemas.microsoft.com/office/word/2023/wordml/word16du" xmlns:w16sdtdh="http://schemas.microsoft.com/office/word/2020/wordml/sdtdatahash" xmlns:w16sdtfl="http://schemas.microsoft.com/office/word/2024/wordml/sdtformatlock" xmlns:w16se="http://schemas.microsoft.com/office/word/2015/wordml/symex" xmlns:wpg="http://schemas.microsoft.com/office/word/2010/wordprocessingGroup" xmlns:wpi="http://schemas.microsoft.com/office/word/2010/wordprocessingInk" xmlns:wne="http://schemas.microsoft.com/office/word/2006/wordml" xmlns:wps="http://schemas.microsoft.com/office/word/2010/wordprocessingShape" mc:Ignorable="w14 w15 w16se w16cid w16 w16cex w16sdtdh w16sdtfl w16du wp14">
+<w:numbering xmlns:wpc="http://schemas.microsoft.com/office/word/2010/wordprocessingCanvas" xmlns:cx="http://schemas.microsoft.com/office/drawing/2014/chartex" xmlns:cx1="http://schemas.microsoft.com/office/drawing/2015/9/8/chartex" xmlns:cx2="http://schemas.microsoft.com/office/drawing/2015/10/21/chartex" xmlns:cx3="http://schemas.microsoft.com/office/drawing/2016/5/9/chartex" xmlns:cx4="http://schemas.microsoft.com/office/drawing/2016/5/10/chartex" xmlns:cx5="http://schemas.microsoft.com/office/drawing/2016/5/11/chartex" xmlns:cx6="http://schemas.microsoft.com/office/drawing/2016/5/12/chartex" xmlns:cx7="http://schemas.microsoft.com/office/drawing/2016/5/13/chartex" xmlns:cx8="http://schemas.microsoft.com/office/drawing/2016/5/14/chartex" xmlns:mc="http://schemas.openxmlformats.org/markup-compatibility/2006" xmlns:aink="http://schemas.microsoft.com/office/drawing/2016/ink" xmlns:am3d="http://schemas.microsoft.com/office/drawing/2017/model3d" xmlns:o="urn:schemas-microsoft-com:office:office" xmlns:r="http://schemas.openxmlformats.org/officeDocument/2006/relationships" xmlns:m="http://schemas.openxmlformats.org/officeDocument/2006/math" xmlns:v="urn:schemas-microsoft-com:vml" xmlns:wp14="http://schemas.microsoft.com/office/word/2010/wordprocessingDrawing" xmlns:wp="http://schemas.openxmlformats.org/drawingml/2006/wordprocessingDrawing" xmlns:w10="urn:schemas-microsoft-com:office:word" xmlns:w="http://schemas.openxmlformats.org/wordprocessingml/2006/main" xmlns:w14="http://schemas.microsoft.com/office/word/2010/wordml" xmlns:w15="http://schemas.microsoft.com/office/word/2012/wordml" xmlns:w16cex="http://schemas.microsoft.com/office/word/2018/wordml/cex" xmlns:w16cid="http://schemas.microsoft.com/office/word/2016/wordml/cid" xmlns:w16="http://schemas.microsoft.com/office/word/2018/wordml" xmlns:w16sdtdh="http://schemas.microsoft.com/office/word/2020/wordml/sdtdatahash" xmlns:w16se="http://schemas.microsoft.com/office/word/2015/wordml/symex" xmlns:wpg="http://schemas.microsoft.com/office/word/2010/wordprocessingGroup" xmlns:wpi="http://schemas.microsoft.com/office/word/2010/wordprocessingInk" xmlns:wne="http://schemas.microsoft.com/office/word/2006/wordml" xmlns:wps="http://schemas.microsoft.com/office/word/2010/wordprocessingShape" mc:Ignorable="w14 w15 w16se w16cid w16 w16cex w16sdtdh wp14">
   <w:abstractNum w:abstractNumId="0" w15:restartNumberingAfterBreak="0">
     <w:nsid w:val="02FA5292"/>
     <w:multiLevelType w:val="multilevel"/>
@@ -2073,29 +2823,29 @@
       </w:rPr>
     </w:lvl>
   </w:abstractNum>
-  <w:num w:numId="1" w16cid:durableId="1536691405">
+  <w:num w:numId="1">
     <w:abstractNumId w:val="2"/>
   </w:num>
-  <w:num w:numId="2" w16cid:durableId="656494723">
+  <w:num w:numId="2">
     <w:abstractNumId w:val="4"/>
   </w:num>
-  <w:num w:numId="3" w16cid:durableId="36202456">
+  <w:num w:numId="3">
     <w:abstractNumId w:val="5"/>
   </w:num>
-  <w:num w:numId="4" w16cid:durableId="1103260046">
+  <w:num w:numId="4">
     <w:abstractNumId w:val="0"/>
   </w:num>
-  <w:num w:numId="5" w16cid:durableId="884754442">
+  <w:num w:numId="5">
     <w:abstractNumId w:val="1"/>
   </w:num>
-  <w:num w:numId="6" w16cid:durableId="2133747153">
+  <w:num w:numId="6">
     <w:abstractNumId w:val="3"/>
   </w:num>
 </w:numbering>
 </file>
 
 <file path=word/styles.xml><?xml version="1.0" encoding="utf-8"?>
-<w:styles xmlns:mc="http://schemas.openxmlformats.org/markup-compatibility/2006" xmlns:r="http://schemas.openxmlformats.org/officeDocument/2006/relationships" xmlns:w="http://schemas.openxmlformats.org/wordprocessingml/2006/main" xmlns:w14="http://schemas.microsoft.com/office/word/2010/wordml" xmlns:w15="http://schemas.microsoft.com/office/word/2012/wordml" xmlns:w16cex="http://schemas.microsoft.com/office/word/2018/wordml/cex" xmlns:w16cid="http://schemas.microsoft.com/office/word/2016/wordml/cid" xmlns:w16="http://schemas.microsoft.com/office/word/2018/wordml" xmlns:w16du="http://schemas.microsoft.com/office/word/2023/wordml/word16du" xmlns:w16sdtdh="http://schemas.microsoft.com/office/word/2020/wordml/sdtdatahash" xmlns:w16sdtfl="http://schemas.microsoft.com/office/word/2024/wordml/sdtformatlock" xmlns:w16se="http://schemas.microsoft.com/office/word/2015/wordml/symex" mc:Ignorable="w14 w15 w16se w16cid w16 w16cex w16sdtdh w16sdtfl w16du">
+<w:styles xmlns:mc="http://schemas.openxmlformats.org/markup-compatibility/2006" xmlns:r="http://schemas.openxmlformats.org/officeDocument/2006/relationships" xmlns:w="http://schemas.openxmlformats.org/wordprocessingml/2006/main" xmlns:w14="http://schemas.microsoft.com/office/word/2010/wordml" xmlns:w15="http://schemas.microsoft.com/office/word/2012/wordml" xmlns:w16cex="http://schemas.microsoft.com/office/word/2018/wordml/cex" xmlns:w16cid="http://schemas.microsoft.com/office/word/2016/wordml/cid" xmlns:w16="http://schemas.microsoft.com/office/word/2018/wordml" xmlns:w16sdtdh="http://schemas.microsoft.com/office/word/2020/wordml/sdtdatahash" xmlns:w16se="http://schemas.microsoft.com/office/word/2015/wordml/symex" mc:Ignorable="w14 w15 w16se w16cid w16 w16cex w16sdtdh">
   <w:docDefaults>
     <w:rPrDefault>
       <w:rPr>
@@ -2493,10 +3243,10 @@
     <w:name w:val="Normal"/>
     <w:qFormat/>
   </w:style>
-  <w:style w:type="paragraph" w:styleId="Heading3">
+  <w:style w:type="paragraph" w:styleId="Ttulo3">
     <w:name w:val="heading 3"/>
     <w:basedOn w:val="Normal"/>
-    <w:link w:val="Heading3Char"/>
+    <w:link w:val="Ttulo3Car"/>
     <w:uiPriority w:val="9"/>
     <w:qFormat/>
     <w:rsid w:val="00EC05BD"/>
@@ -2513,10 +3263,10 @@
       <w:lang w:eastAsia="es-CO"/>
     </w:rPr>
   </w:style>
-  <w:style w:type="paragraph" w:styleId="Heading4">
+  <w:style w:type="paragraph" w:styleId="Ttulo4">
     <w:name w:val="heading 4"/>
     <w:basedOn w:val="Normal"/>
-    <w:link w:val="Heading4Char"/>
+    <w:link w:val="Ttulo4Car"/>
     <w:uiPriority w:val="9"/>
     <w:qFormat/>
     <w:rsid w:val="00EC05BD"/>
@@ -2533,10 +3283,10 @@
       <w:lang w:eastAsia="es-CO"/>
     </w:rPr>
   </w:style>
-  <w:style w:type="paragraph" w:styleId="Heading5">
+  <w:style w:type="paragraph" w:styleId="Ttulo5">
     <w:name w:val="heading 5"/>
     <w:basedOn w:val="Normal"/>
-    <w:link w:val="Heading5Char"/>
+    <w:link w:val="Ttulo5Car"/>
     <w:uiPriority w:val="9"/>
     <w:qFormat/>
     <w:rsid w:val="00EC05BD"/>
@@ -2553,13 +3303,13 @@
       <w:lang w:eastAsia="es-CO"/>
     </w:rPr>
   </w:style>
-  <w:style w:type="character" w:default="1" w:styleId="DefaultParagraphFont">
+  <w:style w:type="character" w:default="1" w:styleId="Fuentedeprrafopredeter">
     <w:name w:val="Default Paragraph Font"/>
     <w:uiPriority w:val="1"/>
     <w:semiHidden/>
     <w:unhideWhenUsed/>
   </w:style>
-  <w:style w:type="table" w:default="1" w:styleId="TableNormal">
+  <w:style w:type="table" w:default="1" w:styleId="Tablanormal">
     <w:name w:val="Normal Table"/>
     <w:uiPriority w:val="99"/>
     <w:semiHidden/>
@@ -2574,16 +3324,16 @@
       </w:tblCellMar>
     </w:tblPr>
   </w:style>
-  <w:style w:type="numbering" w:default="1" w:styleId="NoList">
+  <w:style w:type="numbering" w:default="1" w:styleId="Sinlista">
     <w:name w:val="No List"/>
     <w:uiPriority w:val="99"/>
     <w:semiHidden/>
     <w:unhideWhenUsed/>
   </w:style>
-  <w:style w:type="character" w:customStyle="1" w:styleId="Heading3Char">
-    <w:name w:val="Heading 3 Char"/>
-    <w:basedOn w:val="DefaultParagraphFont"/>
-    <w:link w:val="Heading3"/>
+  <w:style w:type="character" w:customStyle="1" w:styleId="Ttulo3Car">
+    <w:name w:val="Título 3 Car"/>
+    <w:basedOn w:val="Fuentedeprrafopredeter"/>
+    <w:link w:val="Ttulo3"/>
     <w:uiPriority w:val="9"/>
     <w:rsid w:val="00EC05BD"/>
     <w:rPr>
@@ -2595,10 +3345,10 @@
       <w:lang w:eastAsia="es-CO"/>
     </w:rPr>
   </w:style>
-  <w:style w:type="character" w:customStyle="1" w:styleId="Heading4Char">
-    <w:name w:val="Heading 4 Char"/>
-    <w:basedOn w:val="DefaultParagraphFont"/>
-    <w:link w:val="Heading4"/>
+  <w:style w:type="character" w:customStyle="1" w:styleId="Ttulo4Car">
+    <w:name w:val="Título 4 Car"/>
+    <w:basedOn w:val="Fuentedeprrafopredeter"/>
+    <w:link w:val="Ttulo4"/>
     <w:uiPriority w:val="9"/>
     <w:rsid w:val="00EC05BD"/>
     <w:rPr>
@@ -2610,10 +3360,10 @@
       <w:lang w:eastAsia="es-CO"/>
     </w:rPr>
   </w:style>
-  <w:style w:type="character" w:customStyle="1" w:styleId="Heading5Char">
-    <w:name w:val="Heading 5 Char"/>
-    <w:basedOn w:val="DefaultParagraphFont"/>
-    <w:link w:val="Heading5"/>
+  <w:style w:type="character" w:customStyle="1" w:styleId="Ttulo5Car">
+    <w:name w:val="Título 5 Car"/>
+    <w:basedOn w:val="Fuentedeprrafopredeter"/>
+    <w:link w:val="Ttulo5"/>
     <w:uiPriority w:val="9"/>
     <w:rsid w:val="00EC05BD"/>
     <w:rPr>
@@ -2642,9 +3392,9 @@
       <w:lang w:eastAsia="es-CO"/>
     </w:rPr>
   </w:style>
-  <w:style w:type="character" w:styleId="HTMLCode">
+  <w:style w:type="character" w:styleId="CdigoHTML">
     <w:name w:val="HTML Code"/>
-    <w:basedOn w:val="DefaultParagraphFont"/>
+    <w:basedOn w:val="Fuentedeprrafopredeter"/>
     <w:uiPriority w:val="99"/>
     <w:semiHidden/>
     <w:unhideWhenUsed/>

</xml_diff>